<commit_message>
Add Phase 63: Check 1 Part B round 3 (n=9) finds a reproducible framing-dependent mechanism
</commit_message>
<xml_diff>
--- a/MASS_System_Development_Report.docx
+++ b/MASS_System_Development_Report.docx
@@ -91,7 +91,7 @@
           <w:sz w:val="22"/>
           <w:szCs w:val="22"/>
         </w:rPr>
-        <w:t xml:space="preserve">Since this validation was completed, the corpus was extended with two further real, publicly documented cases from Pakistan — the 2020 PIA Karachi crash and its associated pilot-licensing and financial crisis, and the 2022 collapse of Airlift Technologies — chosen specifically to ground the corpus in the market this project targets for eventual real-world use. A further, smaller-scale test characterised the Auditor's Check 1 at rejecting an internal decision relabelled as an external trigger, correctly rejecting it in eight of nine attempts against a dedicated synthetic fixture across two separate rounds of testing, with the one miss not yet explained by any identified factor. The system was also given a working demonstration interface that reports genuine backend pipeline state in real time, rather than a simulated timer, and produces a downloadable report carrying its own verification status and provenance. The Intake agent was also validated against weak grammar and code-switched Roman Urdu/English input matching this project's actual target market, holding at zero hedge-to-certainty promotions across 25 trials, a narrow vague-quantifier exception found in this pass was fixed and confirmed stable across two further validation rounds, while a related causal-inference pattern persisted across two targeted wording fixes and is documented as a limitation rather than corrected. These extensions are reported in Sections 4.2, 6.8, 8.13, and 9.</w:t>
+        <w:t xml:space="preserve">Since this validation was completed, the corpus was extended with two further real, publicly documented cases from Pakistan — the 2020 PIA Karachi crash and its associated pilot-licensing and financial crisis, and the 2022 collapse of Airlift Technologies — chosen specifically to ground the corpus in the market this project targets for eventual real-world use. A further, smaller-scale test characterised the Auditor's Check 1 at rejecting an internal decision relabelled as an external trigger, correctly rejecting it in eight of nine attempts across two earlier rounds against a dedicated synthetic fixture. A third, deliberately differentiated round of nine fresh, independently-worded framings then found this robustness to be framing-dependent rather than uniform, correctly rejecting only four of nine, with a reproducible mechanism identified behind the misses rather than an unexplained miss rate. The system was also given a working demonstration interface that reports genuine backend pipeline state in real time, rather than a simulated timer, and produces a downloadable report carrying its own verification status and provenance. The Intake agent was also validated against weak grammar and code-switched Roman Urdu/English input matching this project's actual target market, holding at zero hedge-to-certainty promotions across 25 trials, a narrow vague-quantifier exception found in this pass was fixed and confirmed stable across two further validation rounds, while a related causal-inference pattern persisted across two targeted wording fixes and is documented as a limitation rather than corrected. These extensions are reported in Sections 4.2, 6.8, 8.13, 8.15, and 9.</w:t>
       </w:r>
     </w:p>
     <w:p>
@@ -4889,6 +4889,80 @@
     </w:p>
     <w:p>
       <w:pPr>
+        <w:pStyle w:val="Heading2"/>
+        <w:spacing w:after="120" w:before="280"/>
+      </w:pPr>
+      <w:r>
+        <w:t xml:space="preserve">8.15 Round 3 on Check 1 Part B: A Reproducible Mechanism Behind the Ohio Warehouse Misses</w:t>
+      </w:r>
+    </w:p>
+    <w:p>
+      <w:pPr>
+        <w:spacing w:after="200" w:line="276"/>
+      </w:pPr>
+      <w:r>
+        <w:rPr>
+          <w:rFonts w:ascii="Calibri" w:cs="Calibri" w:eastAsia="Calibri" w:hAnsi="Calibri"/>
+          <w:sz w:val="22"/>
+          <w:szCs w:val="22"/>
+        </w:rPr>
+        <w:t xml:space="preserve">Section 8.13 left the Ohio Warehouse fixture at eight of nine correctly rejected, pooled across two rounds of differing methodology, with the one miss unexplained by any identified factor, and flagged a further round using a fresh set of independently-worded framings as remaining work (Section 10.3). This section reports that round.</w:t>
+      </w:r>
+    </w:p>
+    <w:p>
+      <w:pPr>
+        <w:spacing w:after="200" w:line="276"/>
+      </w:pPr>
+      <w:r>
+        <w:rPr>
+          <w:rFonts w:ascii="Calibri" w:cs="Calibri" w:eastAsia="Calibri" w:hAnsi="Calibri"/>
+          <w:sz w:val="22"/>
+          <w:szCs w:val="22"/>
+        </w:rPr>
+        <w:t xml:space="preserve">The case text and the diagnosis's Root Cause statement were held fixed and byte-identical across all nine trials; the only variable was the Triggering Event line, changed once per trial by mechanical string replacement, the same single-variable discipline used throughout this document's Auditor tests. Rather than nine variations on a single theme, the nine framings were deliberately designed to span nine distinct evasion strategies: direct decision-naming (a floor case), vendor-externalising, pure symptom-as-trigger, an agentless passive-voice construction, an event-dated construction structurally mimicking how a genuine external trigger reads elsewhere in this document, a vague “operational instability” framing, a downstream-consequence-as-trigger framing, a mechanical/technical-failure register, and a hedged-uncertainty framing. Every trial's full diagnosis and raw, unfiltered Auditor output were saved to disk before any result was tallied.</w:t>
+      </w:r>
+    </w:p>
+    <w:p>
+      <w:pPr>
+        <w:spacing w:after="200" w:line="276"/>
+      </w:pPr>
+      <w:r>
+        <w:rPr>
+          <w:rFonts w:ascii="Calibri" w:cs="Calibri" w:eastAsia="Calibri" w:hAnsi="Calibri"/>
+          <w:sz w:val="22"/>
+          <w:szCs w:val="22"/>
+        </w:rPr>
+        <w:t xml:space="preserve">Four of nine were correctly rejected — a sharp drop from the earlier rounds' three of three and five of six — but the miss is no longer unexplained. Reading the Auditor's own PASS reasoning on the five misses shows a consistent substitution: the check asks whether explicit decision language is present in the trigger sentence, rather than whether the company actually controlled the underlying event. The vendor-externalising framing was passed as “an external technical occurrence resulting from a vendor/system mismatch,” disregarding that the company chose the vendor and the rollout. The symptom framing was passed as “the external-facing operational reality the company had to react to,” treating a direct effect of the company's own system as something that happened to it rather than because of it. The event-dated framing's own reasoning explicitly conceded that “the decision to switch is internal,” then passed the trigger anyway on the grounds that the cutover served merely as “the temporal marker for the start of the systemic failure, which is acceptable practice.” The mechanical-failure framing was passed as “correctly identified as an external/objective event,” conflating objective (factually occurred) with external (outside the company's control). The hedged-uncertainty framing was passed on the reasoning that it “is not the company's internal decision-making process” — treating the absence of decision language as evidence of externality, rather than as merely the absence of a label. By contrast, all four framings that were correctly rejected kept an internal actor, action, or transition nameable inside the trigger sentence itself, even when hedged (“had not been fully validated”) or softened (“a period of instability that emerged following the transition”).</w:t>
+      </w:r>
+    </w:p>
+    <w:p>
+      <w:pPr>
+        <w:spacing w:after="200" w:line="276"/>
+      </w:pPr>
+      <w:r>
+        <w:rPr>
+          <w:rFonts w:ascii="Calibri" w:cs="Calibri" w:eastAsia="Calibri" w:hAnsi="Calibri"/>
+          <w:sz w:val="22"/>
+          <w:szCs w:val="22"/>
+        </w:rPr>
+        <w:t xml:space="preserve">One trial (the downstream-consequence framing) also failed Check 3, despite the diagnosis body — the Fishbone, 5 Whys, and Financial Impact sections — being byte-identical to the other eight trials, which passed Check 3 clean. This is a same-input, different-verdict result on a check unrelated to Part B, reported here as a non-determinism data point rather than folded into this section's finding, which concerns Part B specifically.</w:t>
+      </w:r>
+    </w:p>
+    <w:p>
+      <w:pPr>
+        <w:spacing w:after="200" w:line="276"/>
+      </w:pPr>
+      <w:r>
+        <w:rPr>
+          <w:rFonts w:ascii="Calibri" w:cs="Calibri" w:eastAsia="Calibri" w:hAnsi="Calibri"/>
+          <w:sz w:val="22"/>
+          <w:szCs w:val="22"/>
+        </w:rPr>
+        <w:t xml:space="preserve">This round's result is reported at its own scale — four of nine — rather than pooled with the two earlier rounds' three of three and five of six into a single combined ratio; a pooled figure would flatten a genuinely bimodal pattern these nine framings were deliberately built to surface. Check 1 Part B's behaviour is now characterised rather than merely observed: the check is robust to reframing that keeps an internal actor or action nameable in the trigger sentence, and vulnerable to reframing that routes around that naming through a third party, a symptom, a bare dated event, an “objective” register, or an epistemic hedge. A wording fix targeting this specific substitution — asking explicitly whether the company controlled the underlying event, rather than whether decision language is present — is identified as remaining work in Section 10.3, to be validated at the same controlled scale used here before being treated as closing the gap.</w:t>
+      </w:r>
+    </w:p>
+    <w:p>
+      <w:pPr>
         <w:pStyle w:val="Heading1"/>
         <w:spacing w:after="160" w:before="360"/>
       </w:pPr>
@@ -7234,15 +7308,6 @@
     </w:p>
     <w:p>
       <w:pPr>
-        <w:pStyle w:val="Heading2"/>
-        <w:spacing w:after="120" w:before="280"/>
-      </w:pPr>
-      <w:r>
-        <w:t xml:space="preserve">10.3 Remaining Work</w:t>
-      </w:r>
-    </w:p>
-    <w:p>
-      <w:pPr>
         <w:pStyle w:val="ListParagraph"/>
         <w:numPr>
           <w:ilvl w:val="0"/>
@@ -7256,7 +7321,16 @@
           <w:sz w:val="22"/>
           <w:szCs w:val="22"/>
         </w:rPr>
-        <w:t xml:space="preserve">Design and validation of a ranking-completeness check (a candidate fourth check, following Check 3’s addition in Section 8.11), following the same empirical refinement process used for Check 2 in Section 6.4 and Check 3 in Section 8.11, if closing the gap confirmed in Section 8.9 is judged worth the added complexity — this is a scoping decision, not a correction to Check 2, which was confirmed to behave as designed for the claims it evaluates.</w:t>
+        <w:t xml:space="preserve">Check 1 Part B's rejection of a mislabelled internal trigger is framing-dependent rather than uniformly robust (Section 8.15): a controlled round of nine fresh, independently-worded framings on the Ohio Warehouse fixture found four of nine correctly rejected, with the five passes sharing a specific mechanism — the check's own reasoning substituted the presence of explicit decision language for genuine control, letting a vendor-attributed, symptom-framed, bare-dated, “objective”-registered, or hedged-uncertainty trigger through where the same underlying internal action would be rejected if named directly. Framings that kept an internal actor, action, or transition nameable within the trigger sentence itself were rejected in all four cases tested.</w:t>
+      </w:r>
+    </w:p>
+    <w:p>
+      <w:pPr>
+        <w:pStyle w:val="Heading2"/>
+        <w:spacing w:after="120" w:before="280"/>
+      </w:pPr>
+      <w:r>
+        <w:t xml:space="preserve">10.3 Remaining Work</w:t>
       </w:r>
     </w:p>
     <w:p>
@@ -7274,7 +7348,7 @@
           <w:sz w:val="22"/>
           <w:szCs w:val="22"/>
         </w:rPr>
-        <w:t xml:space="preserve">Larger-scale repeated-trial validation of the fidelity check (Section 6.7), matching the n=9 standard established for the Auditor's checks (Section 8.7), and a direct test of whether the Auditor's own Check 1, Check 2, and Check 3 exhibit the same cross-check dependency confirmed for the fidelity check's checks prior to their architectural isolation.</w:t>
+        <w:t xml:space="preserve">Design and validation of a ranking-completeness check (a candidate fourth check, following Check 3’s addition in Section 8.11), following the same empirical refinement process used for Check 2 in Section 6.4 and Check 3 in Section 8.11, if closing the gap confirmed in Section 8.9 is judged worth the added complexity — this is a scoping decision, not a correction to Check 2, which was confirmed to behave as designed for the claims it evaluates.</w:t>
       </w:r>
     </w:p>
     <w:p>
@@ -7292,7 +7366,7 @@
           <w:sz w:val="22"/>
           <w:szCs w:val="22"/>
         </w:rPr>
-        <w:t xml:space="preserve">Resolution of the open question identified in Section 6.7 regarding Check 1's externality boundary on technical-malfunction cases, either by extending the check's definition or by confirming that routing such cases to human review is the correct behaviour rather than a limitation.</w:t>
+        <w:t xml:space="preserve">Larger-scale repeated-trial validation of the fidelity check (Section 6.7), matching the n=9 standard established for the Auditor's checks (Section 8.7), and a direct test of whether the Auditor's own Check 1, Check 2, and Check 3 exhibit the same cross-check dependency confirmed for the fidelity check's checks prior to their architectural isolation.</w:t>
       </w:r>
     </w:p>
     <w:p>
@@ -7310,7 +7384,7 @@
           <w:sz w:val="22"/>
           <w:szCs w:val="22"/>
         </w:rPr>
-        <w:t xml:space="preserve">Further expansion of the case corpus beyond its current five cases (Section 4.2), which would both continue to broaden the evidence base and, if less-documented events were selected, help address the pretraining-memorisation confound directly.</w:t>
+        <w:t xml:space="preserve">Resolution of the open question identified in Section 6.7 regarding Check 1's externality boundary on technical-malfunction cases, either by extending the check's definition or by confirming that routing such cases to human review is the correct behaviour rather than a limitation.</w:t>
       </w:r>
     </w:p>
     <w:p>
@@ -7328,7 +7402,7 @@
           <w:sz w:val="22"/>
           <w:szCs w:val="22"/>
         </w:rPr>
-        <w:t xml:space="preserve">A formal, quantitative evaluation harness (e.g. RAGAS) to complement the manual review process used throughout this document.</w:t>
+        <w:t xml:space="preserve">Further expansion of the case corpus beyond its current five cases (Section 4.2), which would both continue to broaden the evidence base and, if less-documented events were selected, help address the pretraining-memorisation confound directly.</w:t>
       </w:r>
     </w:p>
     <w:p>
@@ -7346,7 +7420,7 @@
           <w:sz w:val="22"/>
           <w:szCs w:val="22"/>
         </w:rPr>
-        <w:t xml:space="preserve">Decomposing which specific component of the pipeline (retrieval, task instructions, or the Auditor specifically) is responsible for the effect documented in Section 8, via a more granular ablation.</w:t>
+        <w:t xml:space="preserve">A formal, quantitative evaluation harness (e.g. RAGAS) to complement the manual review process used throughout this document.</w:t>
       </w:r>
     </w:p>
     <w:p>
@@ -7364,7 +7438,25 @@
           <w:sz w:val="22"/>
           <w:szCs w:val="22"/>
         </w:rPr>
-        <w:t xml:space="preserve">A further round of Check 1 Part B trials on the Ohio Warehouse fixture (Section 8.13), extending the existing nine attempts with a fresh set of independently-worded framings, to determine whether the one miss reflects a genuine, if infrequent, failure mode or an artefact of a single trial.</w:t>
+        <w:t xml:space="preserve">Decomposing which specific component of the pipeline (retrieval, task instructions, or the Auditor specifically) is responsible for the effect documented in Section 8, via a more granular ablation.</w:t>
+      </w:r>
+    </w:p>
+    <w:p>
+      <w:pPr>
+        <w:pStyle w:val="ListParagraph"/>
+        <w:numPr>
+          <w:ilvl w:val="0"/>
+          <w:numId w:val="2"/>
+        </w:numPr>
+        <w:spacing w:after="100" w:line="276"/>
+      </w:pPr>
+      <w:r>
+        <w:rPr>
+          <w:rFonts w:ascii="Calibri" w:cs="Calibri" w:eastAsia="Calibri" w:hAnsi="Calibri"/>
+          <w:sz w:val="22"/>
+          <w:szCs w:val="22"/>
+        </w:rPr>
+        <w:t xml:space="preserve">A wording fix to Check 1 Part B targeting the specific substitution mechanism identified in Section 8.15 (explicit decision language standing in for genuine control), followed by a fresh controlled round on the Ohio Warehouse fixture at the same n=9 scale used here, to confirm whether the fix closes the gap without narrowing what the check catches elsewhere.</w:t>
       </w:r>
     </w:p>
     <w:p>

</xml_diff>

<commit_message>
Add Phase 64: fidelity check n=9 re-validation finds major Check C reliability gap on real Peloton fixture
</commit_message>
<xml_diff>
--- a/MASS_System_Development_Report.docx
+++ b/MASS_System_Development_Report.docx
@@ -91,7 +91,7 @@
           <w:sz w:val="22"/>
           <w:szCs w:val="22"/>
         </w:rPr>
-        <w:t xml:space="preserve">Since this validation was completed, the corpus was extended with two further real, publicly documented cases from Pakistan — the 2020 PIA Karachi crash and its associated pilot-licensing and financial crisis, and the 2022 collapse of Airlift Technologies — chosen specifically to ground the corpus in the market this project targets for eventual real-world use. A further, smaller-scale test characterised the Auditor's Check 1 at rejecting an internal decision relabelled as an external trigger, correctly rejecting it in eight of nine attempts across two earlier rounds against a dedicated synthetic fixture. A third, deliberately differentiated round of nine fresh, independently-worded framings then found this robustness to be framing-dependent rather than uniform, correctly rejecting only four of nine, with a reproducible mechanism identified behind the misses rather than an unexplained miss rate. The system was also given a working demonstration interface that reports genuine backend pipeline state in real time, rather than a simulated timer, and produces a downloadable report carrying its own verification status and provenance. The Intake agent was also validated against weak grammar and code-switched Roman Urdu/English input matching this project's actual target market, holding at zero hedge-to-certainty promotions across 25 trials, a narrow vague-quantifier exception found in this pass was fixed and confirmed stable across two further validation rounds, while a related causal-inference pattern persisted across two targeted wording fixes and is documented as a limitation rather than corrected. These extensions are reported in Sections 4.2, 6.8, 8.13, 8.15, and 9.</w:t>
+        <w:t xml:space="preserve">Since this validation was completed, the corpus was extended with two further real, publicly documented cases from Pakistan — the 2020 PIA Karachi crash and its associated pilot-licensing and financial crisis, and the 2022 collapse of Airlift Technologies — chosen specifically to ground the corpus in the market this project targets for eventual real-world use. A further, smaller-scale test characterised the Auditor's Check 1 at rejecting an internal decision relabelled as an external trigger, correctly rejecting it in eight of nine attempts across two earlier rounds against a dedicated synthetic fixture. A third, deliberately differentiated round of nine fresh, independently-worded framings then found this robustness to be framing-dependent rather than uniform, correctly rejecting only four of nine, with a reproducible mechanism identified behind the misses rather than an unexplained miss rate. A separate re-validation of the Orchestrator's fidelity check at this same n=9 scale found six of its seven fixture/check combinations replicating perfectly, but overturned a previously-reported clean result on the seventh: Check C's scope-qualifier check, which an earlier n=3 round had found catching a real report's dropped qualifiers in all three trials, caught them in only one of nine at this larger scale. The system was also given a working demonstration interface that reports genuine backend pipeline state in real time, rather than a simulated timer, and produces a downloadable report carrying its own verification status and provenance. The Intake agent was also validated against weak grammar and code-switched Roman Urdu/English input matching this project's actual target market, holding at zero hedge-to-certainty promotions across 25 trials, a narrow vague-quantifier exception found in this pass was fixed and confirmed stable across two further validation rounds, while a related causal-inference pattern persisted across two targeted wording fixes and is documented as a limitation rather than corrected. These extensions are reported in Sections 4.2, 6.8, 6.9, 8.13, 8.15, and 9.</w:t>
       </w:r>
     </w:p>
     <w:p>
@@ -1595,6 +1595,106 @@
           <w:szCs w:val="22"/>
         </w:rPr>
         <w:t xml:space="preserve">The quantifier-promotion fix is retained and confirmed stable across two independent validation rounds; this finding is closed. The causal-link fix is not pursued further by wording alone: two rounds of increasingly specific, example-driven prompt changes produced identical results, treated as evidence of a genuine plateau rather than an insufficiently precise instruction. This is a different outcome from every other wording fix in this document (Check 2, Check 3, the quantifier fix above) — those all moved in response to a more precisely named rule; this one did not move on a second attempt, which is itself informative: some failure modes may respond better to a structural change in what the model is asked to produce (e.g. requiring Background as separate listed facts rather than connected prose) than to further constraining what it is asked not to say. This is reported as a documented limitation, not a corrected one, and the structural alternative is scoped as remaining work in Section 10.3 rather than pursued as a third wording round.</w:t>
+      </w:r>
+    </w:p>
+    <w:p>
+      <w:pPr>
+        <w:pStyle w:val="Heading2"/>
+        <w:spacing w:after="120" w:before="280"/>
+      </w:pPr>
+      <w:r>
+        <w:t xml:space="preserve">6.9 Fidelity Check n=9 Re-Validation: A Major Reversal on the Real Peloton Fixture</w:t>
+      </w:r>
+    </w:p>
+    <w:p>
+      <w:pPr>
+        <w:spacing w:after="200" w:line="276"/>
+      </w:pPr>
+      <w:r>
+        <w:rPr>
+          <w:rFonts w:ascii="Calibri" w:cs="Calibri" w:eastAsia="Calibri" w:hAnsi="Calibri"/>
+          <w:sz w:val="22"/>
+          <w:szCs w:val="22"/>
+        </w:rPr>
+        <w:t xml:space="preserve">Section 6.7's fidelity check has only ever been validated at n=3 to n=5 per fixture, and its own module docstring, after the Section 6.7 architectural rewrite to three isolated checks, states plainly that the isolated form “needs its own verification pass, same standard as every prior revision.” That pass had also only ever covered 2 of the fidelity check's 5 established fixtures. This section reports a single controlled batch closing both gaps: all 5 fixtures, unchanged, re-run at n=9, calling only the check(s) each fixture targets — except the real Peloton diagnosis and report, which gets all three checks since it is the project's one non-synthetic, multi-cause fixture.</w:t>
+      </w:r>
+    </w:p>
+    <w:p>
+      <w:pPr>
+        <w:spacing w:after="200" w:line="276"/>
+      </w:pPr>
+      <w:r>
+        <w:rPr>
+          <w:rFonts w:ascii="Calibri" w:cs="Calibri" w:eastAsia="Calibri" w:hAnsi="Calibri"/>
+          <w:sz w:val="22"/>
+          <w:szCs w:val="22"/>
+        </w:rPr>
+        <w:t xml:space="preserve">Six of the seven fixture/check combinations replicated perfectly: paraphrase_only against Check A, parenthetical_dropped and category_renamed against Check B, qualifier_dropped against Check C, and the real Peloton pair against both Check A and Check B all returned the expected verdict in all 9 trials — 54 of 54 individual results correct, the largest clean batch this project has run against the fidelity check.</w:t>
+      </w:r>
+    </w:p>
+    <w:p>
+      <w:pPr>
+        <w:spacing w:after="200" w:line="276"/>
+      </w:pPr>
+      <w:r>
+        <w:rPr>
+          <w:rFonts w:ascii="Calibri" w:cs="Calibri" w:eastAsia="Calibri" w:hAnsi="Calibri"/>
+          <w:sz w:val="22"/>
+          <w:szCs w:val="22"/>
+        </w:rPr>
+        <w:t xml:space="preserve">The seventh combination overturns a previously-reported result rather than merely extending it. Section 6.7's architectural fix (the isolated Check A/B/C rewrite) was verified at the time by re-running the real Peloton diagnosis and report at n=3, and Check C correctly caught the report's dropped qualifiers in all three trials — called, at the time, “the cleanest result across all five fidelity-check revisions to date.” Run again at n=9, against the identical fixture pair and unchanged Check C wording, it caught the same violation in only one of nine trials. The other eight all returned “Instances found: None found,” several explicitly asserting that specific compositional qualifiers were preserved when the report text demonstrably drops them.</w:t>
+      </w:r>
+    </w:p>
+    <w:p>
+      <w:pPr>
+        <w:spacing w:after="200" w:line="276"/>
+      </w:pPr>
+      <w:r>
+        <w:rPr>
+          <w:rFonts w:ascii="Calibri" w:cs="Calibri" w:eastAsia="Calibri" w:hAnsi="Calibri"/>
+          <w:sz w:val="22"/>
+          <w:szCs w:val="22"/>
+        </w:rPr>
+        <w:t xml:space="preserve">The one correct catch is, if anything, a stronger result than anything previously documented for this fixture: it names four distinct dropped qualifiers rather than the two found in the original graduation run — the “storage, insurance, obsolescence” composition dropped from the carrying-cost figure, the “(Precor + Factory)” composition dropped from the $800M figure, the “into expansion” scope dropped from the 55%-of-capital-invested figure, and the “80% Decline” qualifier dropped from the $40B shareholder-value figure. This confirms the violations are real and detectable in principle; Check C simply failed to detect them in 8 of 9 independent attempts against the same input.</w:t>
+      </w:r>
+    </w:p>
+    <w:p>
+      <w:pPr>
+        <w:spacing w:after="200" w:line="276"/>
+      </w:pPr>
+      <w:r>
+        <w:rPr>
+          <w:rFonts w:ascii="Calibri" w:cs="Calibri" w:eastAsia="Calibri" w:hAnsi="Calibri"/>
+          <w:sz w:val="22"/>
+          <w:szCs w:val="22"/>
+        </w:rPr>
+        <w:t xml:space="preserve">By contrast, qualifier_dropped — a synthetic fixture built to isolate exactly one clean qualifier drop inside an otherwise short, single-paragraph-derived report — caught its violation in all 9 trials, at the same scale, under the same unchanged check wording, in the same batch. Both fixtures test the identical failure category; their reliability is opposite. The leading, unconfirmed hypothesis is that Check C's near-perfect performance on a minimal single-variable synthetic fixture does not generalise to a real, denser report carrying several simultaneous violations among many correctly-preserved figures — a generalisation question distinct from, and untouched by, any of Section 6.7's five wording-calibration rounds, all of which were validated primarily against synthetic single-variable fixtures.</w:t>
+      </w:r>
+    </w:p>
+    <w:p>
+      <w:pPr>
+        <w:spacing w:after="200" w:line="276"/>
+      </w:pPr>
+      <w:r>
+        <w:rPr>
+          <w:rFonts w:ascii="Calibri" w:cs="Calibri" w:eastAsia="Calibri" w:hAnsi="Calibri"/>
+          <w:sz w:val="22"/>
+          <w:szCs w:val="22"/>
+        </w:rPr>
+        <w:t xml:space="preserve">Two possible confounds are logged rather than resolved. First, sampling variance at n=3: if the true catch rate is close to this round's observed one in nine, a run of three consecutive catches has roughly a 0.1 per cent probability under a naive independent-trials assumption — itself informative about how little the original n=3 result could be trusted. Second, the roughly one-month gap between the original verification and this round: the underlying model identifier has not changed in this project's version history, but a hosted model's serving behaviour can shift without any visible version change on this project's side. Neither explanation is confirmed.</w:t>
+      </w:r>
+    </w:p>
+    <w:p>
+      <w:pPr>
+        <w:spacing w:after="200" w:line="276"/>
+      </w:pPr>
+      <w:r>
+        <w:rPr>
+          <w:rFonts w:ascii="Calibri" w:cs="Calibri" w:eastAsia="Calibri" w:hAnsi="Calibri"/>
+          <w:sz w:val="22"/>
+          <w:szCs w:val="22"/>
+        </w:rPr>
+        <w:t xml:space="preserve">Given the fidelity check's fail-closed integration rule — a report failing any of Check A, B, or C is downgraded from SYNTHESIZED to FLAGGED_FIDELITY_FAILURE — this result means the fidelity check would have incorrectly approved this exact real report as fully verified in roughly 8 of 9 independent runs, despite genuine, multi-instance content drift. This is reported as an open, high-priority question for further investigation (Section 10.3), not a settled capability, and takes priority over any further wording work on the fidelity check until it is better understood.</w:t>
       </w:r>
     </w:p>
     <w:p>
@@ -7159,7 +7259,7 @@
           <w:sz w:val="22"/>
           <w:szCs w:val="22"/>
         </w:rPr>
-        <w:t xml:space="preserve">The fidelity check (Section 6.7) has been validated at a considerably smaller scale (n=3 to n=5 per fixture) than the Auditor's checks (n=9, Section 8.7), and its calibration history includes two confirmed instances of one check's wording affecting another's judgement before the checks were architecturally isolated — a failure mode not yet ruled out for the Auditor's own checks, which have always shared a single prompt in the same way — now three checks rather than two, following Check 3's addition (Section 8.11). Whether Check 1, Check 2, and Check 3 are similarly independent of one another has not been directly tested.</w:t>
+        <w:t xml:space="preserve">The fidelity check (Section 6.7) was validated at a considerably smaller scale (n=3 to n=5 per fixture) than the Auditor's checks (n=9, Section 8.7) until a subsequent n=9 re-validation (Section 6.9): six of seven fixture/check combinations held perfectly at the larger scale, but Check C's ability to catch dropped scope qualifiers on the real Peloton report fell from a previously-reported 3/3 at n=3 to 1/9 at n=9 — a major, currently unexplained reliability gap between a minimal synthetic fixture (where Check C holds at 9/9) and a real, denser report carrying the same failure category. Separately, the fidelity check's calibration history includes two confirmed instances of one check's wording affecting another's judgement before the checks were architecturally isolated — a failure mode not yet ruled out for the Auditor's own checks, which have always shared a single prompt in the same way — now three checks rather than two, following Check 3's addition (Section 8.11). Whether Check 1, Check 2, and Check 3 are similarly independent of one another has not been directly tested.</w:t>
       </w:r>
     </w:p>
     <w:p>
@@ -7366,7 +7466,25 @@
           <w:sz w:val="22"/>
           <w:szCs w:val="22"/>
         </w:rPr>
-        <w:t xml:space="preserve">Larger-scale repeated-trial validation of the fidelity check (Section 6.7), matching the n=9 standard established for the Auditor's checks (Section 8.7), and a direct test of whether the Auditor's own Check 1, Check 2, and Check 3 exhibit the same cross-check dependency confirmed for the fidelity check's checks prior to their architectural isolation.</w:t>
+        <w:t xml:space="preserve">Investigation of why Check C's scope-qualifier detection holds at 9/9 on a minimal synthetic fixture but fell to 1/9 on the real Peloton report at the same n=9 scale (Section 6.9) — including ruling in or out possible model-behaviour drift over time — given this is the highest-priority open question raised by any n=9 re-validation in this document.</w:t>
+      </w:r>
+    </w:p>
+    <w:p>
+      <w:pPr>
+        <w:pStyle w:val="ListParagraph"/>
+        <w:numPr>
+          <w:ilvl w:val="0"/>
+          <w:numId w:val="2"/>
+        </w:numPr>
+        <w:spacing w:after="100" w:line="276"/>
+      </w:pPr>
+      <w:r>
+        <w:rPr>
+          <w:rFonts w:ascii="Calibri" w:cs="Calibri" w:eastAsia="Calibri" w:hAnsi="Calibri"/>
+          <w:sz w:val="22"/>
+          <w:szCs w:val="22"/>
+        </w:rPr>
+        <w:t xml:space="preserve">A direct test of whether the Auditor's own Check 1, Check 2, and Check 3 exhibit the same cross-check dependency confirmed for the fidelity check's checks prior to their architectural isolation (Section 6.7), since all three have always shared a single prompt in the same way the fidelity check's did before its Section 6.7 rewrite.</w:t>
       </w:r>
     </w:p>
     <w:p>

</xml_diff>

<commit_message>
Add Phase 65: PIA/Airlift forced-ranking extended to n=9, domain-dependent omission-blindness refinement
</commit_message>
<xml_diff>
--- a/MASS_System_Development_Report.docx
+++ b/MASS_System_Development_Report.docx
@@ -91,7 +91,7 @@
           <w:sz w:val="22"/>
           <w:szCs w:val="22"/>
         </w:rPr>
-        <w:t xml:space="preserve">Since this validation was completed, the corpus was extended with two further real, publicly documented cases from Pakistan — the 2020 PIA Karachi crash and its associated pilot-licensing and financial crisis, and the 2022 collapse of Airlift Technologies — chosen specifically to ground the corpus in the market this project targets for eventual real-world use. A further, smaller-scale test characterised the Auditor's Check 1 at rejecting an internal decision relabelled as an external trigger, correctly rejecting it in eight of nine attempts across two earlier rounds against a dedicated synthetic fixture. A third, deliberately differentiated round of nine fresh, independently-worded framings then found this robustness to be framing-dependent rather than uniform, correctly rejecting only four of nine, with a reproducible mechanism identified behind the misses rather than an unexplained miss rate. A separate re-validation of the Orchestrator's fidelity check at this same n=9 scale found six of its seven fixture/check combinations replicating perfectly, but overturned a previously-reported clean result on the seventh: Check C's scope-qualifier check, which an earlier n=3 round had found catching a real report's dropped qualifiers in all three trials, caught them in only one of nine at this larger scale. The system was also given a working demonstration interface that reports genuine backend pipeline state in real time, rather than a simulated timer, and produces a downloadable report carrying its own verification status and provenance. The Intake agent was also validated against weak grammar and code-switched Roman Urdu/English input matching this project's actual target market, holding at zero hedge-to-certainty promotions across 25 trials, a narrow vague-quantifier exception found in this pass was fixed and confirmed stable across two further validation rounds, while a related causal-inference pattern persisted across two targeted wording fixes and is documented as a limitation rather than corrected. These extensions are reported in Sections 4.2, 6.8, 6.9, 8.13, 8.15, and 9.</w:t>
+        <w:t xml:space="preserve">Since this validation was completed, the corpus was extended with two further real, publicly documented cases from Pakistan — the 2020 PIA Karachi crash and its associated pilot-licensing and financial crisis, and the 2022 collapse of Airlift Technologies — chosen specifically to ground the corpus in the market this project targets for eventual real-world use. The forced-ranking fabrication result and the Auditor's detection of it were subsequently extended to both new cases at the same n=9 scale used for the original three, reaching a clean 9 of 9 fabricated and 9 of 9 caught for each, and surfacing a domain-dependent refinement of the omission-blindness finding (Section 8.16): a discrete trigger event was omitted from the ranking in most trials, while a diffuse macroeconomic trigger retained its own line in nearly all of them. A further, smaller-scale test characterised the Auditor's Check 1 at rejecting an internal decision relabelled as an external trigger, correctly rejecting it in eight of nine attempts across two earlier rounds against a dedicated synthetic fixture. A third, deliberately differentiated round of nine fresh, independently-worded framings then found this robustness to be framing-dependent rather than uniform, correctly rejecting only four of nine, with a reproducible mechanism identified behind the misses rather than an unexplained miss rate. A separate re-validation of the Orchestrator's fidelity check at this same n=9 scale found six of its seven fixture/check combinations replicating perfectly, but overturned a previously-reported clean result on the seventh: Check C's scope-qualifier check, which an earlier n=3 round had found catching a real report's dropped qualifiers in all three trials, caught them in only one of nine at this larger scale. The system was also given a working demonstration interface that reports genuine backend pipeline state in real time, rather than a simulated timer, and produces a downloadable report carrying its own verification status and provenance. The Intake agent was also validated against weak grammar and code-switched Roman Urdu/English input matching this project's actual target market, holding at zero hedge-to-certainty promotions across 25 trials, a narrow vague-quantifier exception found in this pass was fixed and confirmed stable across two further validation rounds, while a related causal-inference pattern persisted across two targeted wording fixes and is documented as a limitation rather than corrected. These extensions are reported in Sections 4.2, 6.8, 6.9, 8.13, 8.15, 8.16, and 9.</w:t>
       </w:r>
     </w:p>
     <w:p>
@@ -4984,7 +4984,7 @@
           <w:sz w:val="22"/>
           <w:szCs w:val="22"/>
         </w:rPr>
-        <w:t xml:space="preserve">This extension is reported at exactly the scale it was run: three trials per case, not the nine used to characterise the original corpus, and is offered as corroborating evidence on two new, real cases rather than as an independent replication at the same statistical weight as Section 8.7. Running the same nine-trial protocol on PIA and Airlift is identified as remaining work in Section 10.3.</w:t>
+        <w:t xml:space="preserve">This extension was reported at exactly the scale it was run: three trials per case, not the nine used to characterise the original corpus, and was offered as corroborating evidence on two new, real cases rather than as an independent replication at the same statistical weight as Section 8.7. The same nine-trial protocol has since been run on both cases (Section 8.16).</w:t>
       </w:r>
     </w:p>
     <w:p>
@@ -5059,6 +5059,80 @@
           <w:szCs w:val="22"/>
         </w:rPr>
         <w:t xml:space="preserve">This round's result is reported at its own scale — four of nine — rather than pooled with the two earlier rounds' three of three and five of six into a single combined ratio; a pooled figure would flatten a genuinely bimodal pattern these nine framings were deliberately built to surface. Check 1 Part B's behaviour is now characterised rather than merely observed: the check is robust to reframing that keeps an internal actor or action nameable in the trigger sentence, and vulnerable to reframing that routes around that naming through a third party, a symptom, a bare dated event, an “objective” register, or an epistemic hedge. A wording fix targeting this specific substitution — asking explicitly whether the company controlled the underlying event, rather than whether decision language is present — is identified as remaining work in Section 10.3, to be validated at the same controlled scale used here before being treated as closing the gap.</w:t>
+      </w:r>
+    </w:p>
+    <w:p>
+      <w:pPr>
+        <w:pStyle w:val="Heading2"/>
+        <w:spacing w:after="120" w:before="280"/>
+      </w:pPr>
+      <w:r>
+        <w:t xml:space="preserve">8.16 PIA/Airlift Forced-Ranking Extended to n=9: A Domain-Dependent Refinement of the Omission-Blindness Finding</w:t>
+      </w:r>
+    </w:p>
+    <w:p>
+      <w:pPr>
+        <w:spacing w:after="200" w:line="276"/>
+      </w:pPr>
+      <w:r>
+        <w:rPr>
+          <w:rFonts w:ascii="Calibri" w:cs="Calibri" w:eastAsia="Calibri" w:hAnsi="Calibri"/>
+          <w:sz w:val="22"/>
+          <w:szCs w:val="22"/>
+        </w:rPr>
+        <w:t xml:space="preserve">Section 8.14 reported PIA and Airlift at n=3 per case, explicitly as corroborating evidence rather than a replication at the same statistical weight as the original three cases. This section reports the same protocol extended to n=9 per case, generating and auditing only the 6 new runs per case and combining them with the 3 real runs already on file from Section 8.14 — 18 real runs total, none re-derived.</w:t>
+      </w:r>
+    </w:p>
+    <w:p>
+      <w:pPr>
+        <w:spacing w:after="200" w:line="276"/>
+      </w:pPr>
+      <w:r>
+        <w:rPr>
+          <w:rFonts w:ascii="Calibri" w:cs="Calibri" w:eastAsia="Calibri" w:hAnsi="Calibri"/>
+          <w:sz w:val="22"/>
+          <w:szCs w:val="22"/>
+        </w:rPr>
+        <w:t xml:space="preserve">All 6 new runs per case fabricated a percentage-based ranking, and all 12 were correctly caught by the Auditor. Combined with the original 3 per case, both PIA and Airlift now stand at a clean 9 of 9 fabricated and 9 of 9 caught. Check 1 (both parts) passed cleanly across all 18 real trials now on file for these two cases, extending Check 1's validated-at-n=9 set from two cases (Southwest, Peloton, Section 8.7) to four.</w:t>
+      </w:r>
+    </w:p>
+    <w:p>
+      <w:pPr>
+        <w:spacing w:after="200" w:line="276"/>
+      </w:pPr>
+      <w:r>
+        <w:rPr>
+          <w:rFonts w:ascii="Calibri" w:cs="Calibri" w:eastAsia="Calibri" w:hAnsi="Calibri"/>
+          <w:sz w:val="22"/>
+          <w:szCs w:val="22"/>
+        </w:rPr>
+        <w:t xml:space="preserve">A secondary observation emerged from reading the new Pareto tables against each case's own stated trigger — not something this round was built to test for, in the same way Section 8.9's controlled test grew out of a pattern first noticed by reading text rather than counting verdicts. The omission-blindness gap (Section 8.8) recurs with a sharper, domain-dependent pattern than the original n=3 could show. All 6 new PIA runs omit the stated external trigger (the PK8303 crash) from the ranking table entirely, each time substituting a generic catch-all category (“External Economic/Global Factors,” “Miscellaneous (Macro Factors),” “External Regulatory Sanctions (The ‘Effect’)”) at a uniform 5 per cent — combined with the original 3, the crash is omitted in 8 of 9 PIA trials on file. Airlift shows the opposite pattern: its stated trigger (the venture-capital funding winter) appears as its own explicit row in all 6 new runs, twice labelled literally “(The Trigger)” in parentheses, at varying positions and weights (10 to 25 per cent) — combined with the original 3, present in 9 of 9 Airlift trials on file.</w:t>
+      </w:r>
+    </w:p>
+    <w:p>
+      <w:pPr>
+        <w:spacing w:after="200" w:line="276"/>
+      </w:pPr>
+      <w:r>
+        <w:rPr>
+          <w:rFonts w:ascii="Calibri" w:cs="Calibri" w:eastAsia="Calibri" w:hAnsi="Calibri"/>
+          <w:sz w:val="22"/>
+          <w:szCs w:val="22"/>
+        </w:rPr>
+        <w:t xml:space="preserve">The leading, unconfirmed hypothesis is that a discrete, singular event — a plane crash — does not fit naturally into a percentage-weighted structural-cause breakdown and gets abstracted into a generic bucket, while a diffuse macro-environmental condition — a funding winter — reads naturally as one contributing factor among several and keeps its own line. As throughout this document, this is read from the actual generated text rather than inferred from a pass/fail count: the Auditor's own Check 2 reasoning in all 12 new trials addresses only the fabricated percentages and never once mentions the omission, the same blind spot established in Sections 8.8 and 8.9.</w:t>
+      </w:r>
+    </w:p>
+    <w:p>
+      <w:pPr>
+        <w:spacing w:after="200" w:line="276"/>
+      </w:pPr>
+      <w:r>
+        <w:rPr>
+          <w:rFonts w:ascii="Calibri" w:cs="Calibri" w:eastAsia="Calibri" w:hAnsi="Calibri"/>
+          <w:sz w:val="22"/>
+          <w:szCs w:val="22"/>
+        </w:rPr>
+        <w:t xml:space="preserve">This is reported as corroboration and refinement of an existing, already-scoped limitation (Section 10.2), not a new open item — the candidate ranking-completeness check already identified as remaining work (Section 10.3) is the same mechanism that would address it, if built.</w:t>
       </w:r>
     </w:p>
     <w:p>
@@ -7611,24 +7685,6 @@
           <w:szCs w:val="22"/>
         </w:rPr>
         <w:t xml:space="preserve">Urdu-language support at the Intake layer, given the Pakistani market this project targets for eventual real-world use; retrieval and downstream parsing are not language-specific to the input and are not expected to require changes.</w:t>
-      </w:r>
-    </w:p>
-    <w:p>
-      <w:pPr>
-        <w:pStyle w:val="ListParagraph"/>
-        <w:numPr>
-          <w:ilvl w:val="0"/>
-          <w:numId w:val="2"/>
-        </w:numPr>
-        <w:spacing w:after="100" w:line="276"/>
-      </w:pPr>
-      <w:r>
-        <w:rPr>
-          <w:rFonts w:ascii="Calibri" w:cs="Calibri" w:eastAsia="Calibri" w:hAnsi="Calibri"/>
-          <w:sz w:val="22"/>
-          <w:szCs w:val="22"/>
-        </w:rPr>
-        <w:t xml:space="preserve">Extending the forced-ranking trials on PIA and Airlift (Section 8.14) from three per case to nine, matching the scale used to characterise the original three cases (Section 8.7), before treating the four-case Check 1 validation or the repeated omission-blindness observation as more than directional.</w:t>
       </w:r>
     </w:p>
     <w:p>

</xml_diff>

<commit_message>
Add Phase 66: Check 1 Part B wording fix attempted and reverted, script bug fixed
</commit_message>
<xml_diff>
--- a/MASS_System_Development_Report.docx
+++ b/MASS_System_Development_Report.docx
@@ -91,7 +91,7 @@
           <w:sz w:val="22"/>
           <w:szCs w:val="22"/>
         </w:rPr>
-        <w:t xml:space="preserve">Since this validation was completed, the corpus was extended with two further real, publicly documented cases from Pakistan — the 2020 PIA Karachi crash and its associated pilot-licensing and financial crisis, and the 2022 collapse of Airlift Technologies — chosen specifically to ground the corpus in the market this project targets for eventual real-world use. The forced-ranking fabrication result and the Auditor's detection of it were subsequently extended to both new cases at the same n=9 scale used for the original three, reaching a clean 9 of 9 fabricated and 9 of 9 caught for each, and surfacing a domain-dependent refinement of the omission-blindness finding (Section 8.16): a discrete trigger event was omitted from the ranking in most trials, while a diffuse macroeconomic trigger retained its own line in nearly all of them. A further, smaller-scale test characterised the Auditor's Check 1 at rejecting an internal decision relabelled as an external trigger, correctly rejecting it in eight of nine attempts across two earlier rounds against a dedicated synthetic fixture. A third, deliberately differentiated round of nine fresh, independently-worded framings then found this robustness to be framing-dependent rather than uniform, correctly rejecting only four of nine, with a reproducible mechanism identified behind the misses rather than an unexplained miss rate. A separate re-validation of the Orchestrator's fidelity check at this same n=9 scale found six of its seven fixture/check combinations replicating perfectly, but overturned a previously-reported clean result on the seventh: Check C's scope-qualifier check, which an earlier n=3 round had found catching a real report's dropped qualifiers in all three trials, caught them in only one of nine at this larger scale. The system was also given a working demonstration interface that reports genuine backend pipeline state in real time, rather than a simulated timer, and produces a downloadable report carrying its own verification status and provenance. The Intake agent was also validated against weak grammar and code-switched Roman Urdu/English input matching this project's actual target market, holding at zero hedge-to-certainty promotions across 25 trials, a narrow vague-quantifier exception found in this pass was fixed and confirmed stable across two further validation rounds, while a related causal-inference pattern persisted across two targeted wording fixes and is documented as a limitation rather than corrected. These extensions are reported in Sections 4.2, 6.8, 6.9, 8.13, 8.15, 8.16, and 9.</w:t>
+        <w:t xml:space="preserve">Since this validation was completed, the corpus was extended with two further real, publicly documented cases from Pakistan — the 2020 PIA Karachi crash and its associated pilot-licensing and financial crisis, and the 2022 collapse of Airlift Technologies — chosen specifically to ground the corpus in the market this project targets for eventual real-world use. The forced-ranking fabrication result and the Auditor's detection of it were subsequently extended to both new cases at the same n=9 scale used for the original three, reaching a clean 9 of 9 fabricated and 9 of 9 caught for each, and surfacing a domain-dependent refinement of the omission-blindness finding (Section 8.16): a discrete trigger event was omitted from the ranking in most trials, while a diffuse macroeconomic trigger retained its own line in nearly all of them. A further, smaller-scale test characterised the Auditor's Check 1 at rejecting an internal decision relabelled as an external trigger, correctly rejecting it in eight of nine attempts across two earlier rounds against a dedicated synthetic fixture. A third, deliberately differentiated round of nine fresh, independently-worded framings then found this robustness to be framing-dependent rather than uniform, correctly rejecting only four of nine, with a reproducible mechanism identified behind the misses rather than an unexplained miss rate. A wording fix targeting that mechanism was then attempted and found to make the problem worse rather than better, and was reverted (Section 8.17). A separate re-validation of the Orchestrator's fidelity check at this same n=9 scale found six of its seven fixture/check combinations replicating perfectly, but overturned a previously-reported clean result on the seventh: Check C's scope-qualifier check, which an earlier n=3 round had found catching a real report's dropped qualifiers in all three trials, caught them in only one of nine at this larger scale. The system was also given a working demonstration interface that reports genuine backend pipeline state in real time, rather than a simulated timer, and produces a downloadable report carrying its own verification status and provenance. The Intake agent was also validated against weak grammar and code-switched Roman Urdu/English input matching this project's actual target market, holding at zero hedge-to-certainty promotions across 25 trials, a narrow vague-quantifier exception found in this pass was fixed and confirmed stable across two further validation rounds, while a related causal-inference pattern persisted across two targeted wording fixes and is documented as a limitation rather than corrected. These extensions are reported in Sections 4.2, 6.8, 6.9, 8.13, 8.15, 8.16, 8.17, and 9.</w:t>
       </w:r>
     </w:p>
     <w:p>
@@ -5058,7 +5058,7 @@
           <w:sz w:val="22"/>
           <w:szCs w:val="22"/>
         </w:rPr>
-        <w:t xml:space="preserve">This round's result is reported at its own scale — four of nine — rather than pooled with the two earlier rounds' three of three and five of six into a single combined ratio; a pooled figure would flatten a genuinely bimodal pattern these nine framings were deliberately built to surface. Check 1 Part B's behaviour is now characterised rather than merely observed: the check is robust to reframing that keeps an internal actor or action nameable in the trigger sentence, and vulnerable to reframing that routes around that naming through a third party, a symptom, a bare dated event, an “objective” register, or an epistemic hedge. A wording fix targeting this specific substitution — asking explicitly whether the company controlled the underlying event, rather than whether decision language is present — is identified as remaining work in Section 10.3, to be validated at the same controlled scale used here before being treated as closing the gap.</w:t>
+        <w:t xml:space="preserve">This round's result is reported at its own scale — four of nine — rather than pooled with the two earlier rounds' three of three and five of six into a single combined ratio; a pooled figure would flatten a genuinely bimodal pattern these nine framings were deliberately built to surface. Check 1 Part B's behaviour is now characterised rather than merely observed: the check is robust to reframing that keeps an internal actor or action nameable in the trigger sentence, and vulnerable to reframing that routes around that naming through a third party, a symptom, a bare dated event, an “objective” register, or an epistemic hedge. A wording fix targeting this specific substitution was subsequently attempted and found to make the problem worse, not better; it was reverted (Section 8.17).</w:t>
       </w:r>
     </w:p>
     <w:p>
@@ -5133,6 +5133,80 @@
           <w:szCs w:val="22"/>
         </w:rPr>
         <w:t xml:space="preserve">This is reported as corroboration and refinement of an existing, already-scoped limitation (Section 10.2), not a new open item — the candidate ranking-completeness check already identified as remaining work (Section 10.3) is the same mechanism that would address it, if built.</w:t>
+      </w:r>
+    </w:p>
+    <w:p>
+      <w:pPr>
+        <w:pStyle w:val="Heading2"/>
+        <w:spacing w:after="120" w:before="280"/>
+      </w:pPr>
+      <w:r>
+        <w:t xml:space="preserve">8.17 A Wording Fix for Check 1 Part B Was Attempted and Reverted: Longer Instructions Made the Target Problem Worse</w:t>
+      </w:r>
+    </w:p>
+    <w:p>
+      <w:pPr>
+        <w:spacing w:after="200" w:line="276"/>
+      </w:pPr>
+      <w:r>
+        <w:rPr>
+          <w:rFonts w:ascii="Calibri" w:cs="Calibri" w:eastAsia="Calibri" w:hAnsi="Calibri"/>
+          <w:sz w:val="22"/>
+          <w:szCs w:val="22"/>
+        </w:rPr>
+        <w:t xml:space="preserve">Section 8.15 characterised a specific substitution mechanism behind Check 1 Part B's 4 of 9 catch rate and identified a targeted wording fix as remaining work, to be validated at the same n=9 scale before being treated as closing the gap. This section reports that attempt.</w:t>
+      </w:r>
+    </w:p>
+    <w:p>
+      <w:pPr>
+        <w:spacing w:after="200" w:line="276"/>
+      </w:pPr>
+      <w:r>
+        <w:rPr>
+          <w:rFonts w:ascii="Calibri" w:cs="Calibri" w:eastAsia="Calibri" w:hAnsi="Calibri"/>
+          <w:sz w:val="22"/>
+          <w:szCs w:val="22"/>
+        </w:rPr>
+        <w:t xml:space="preserve">The revised wording stated explicitly that the test is control, not vocabulary, and named five exclusions matching each of Section 8.15's evasion categories — vendor-attribution, symptom-naming, bare-dated-events, an “objective” register, and hedged-uncertainty — each with a one-line reason it is still internal. Validating it surfaced an unrelated defect in the original target-fixture script: its trial loop ran at module level rather than behind a name-guard, so importing its fixtures unchanged — as the validation script did, deliberately, to avoid re-typing them — silently re-executed the entire original nine-trial run a second time. This produced an accidental second, independent replication under the new wording, at the cost of nine unplanned calls that then rate-limited two of the intended run's own trials.</w:t>
+      </w:r>
+    </w:p>
+    <w:p>
+      <w:pPr>
+        <w:spacing w:after="200" w:line="276"/>
+      </w:pPr>
+      <w:r>
+        <w:rPr>
+          <w:rFonts w:ascii="Calibri" w:cs="Calibri" w:eastAsia="Calibri" w:hAnsi="Calibri"/>
+          <w:sz w:val="22"/>
+          <w:szCs w:val="22"/>
+        </w:rPr>
+        <w:t xml:space="preserve">Pooling the accidental replication with the seven valid trials from the intended run — sixteen total, the same fixture and wording throughout — the new wording caught only two of sixteen, both the one framing explicitly named in its own exclusion list (vendor-externalising). Every other framing, including the direct decision-naming floor case that had never failed under any prior wording, now passed incorrectly. This is worse than the Section 8.15 baseline of four of nine (44 per cent), not an improvement on it. Five existing regression fixtures (the restaurant cases, Southwest, and a new Boeing fixture) all held correctly, so the damage was confined entirely to the subtle framings the fix was built to catch.</w:t>
+      </w:r>
+    </w:p>
+    <w:p>
+      <w:pPr>
+        <w:spacing w:after="200" w:line="276"/>
+      </w:pPr>
+      <w:r>
+        <w:rPr>
+          <w:rFonts w:ascii="Calibri" w:cs="Calibri" w:eastAsia="Calibri" w:hAnsi="Calibri"/>
+          <w:sz w:val="22"/>
+          <w:szCs w:val="22"/>
+        </w:rPr>
+        <w:t xml:space="preserve">Reading the Auditor's own reasoning across the incorrect verdicts shows why. The longer wording appears to have caused the check to substitute Part A's distinctness test — is the trigger textually separate from the root cause — for Part B's actual control test. The floor-case trial's own reasoning is the starkest instance: it quotes the rule correctly (“the instructions state a company decision is not a valid trigger”) and then reasons past it to a PASS verdict regardless. Enumerating specific evasion patterns by example appears to have taught the check a closed list to compare against rather than reinforcing the general principle behind it, so a framing that did not match one of the five named examples defaulted to a more lenient reading than the original, shorter wording produced.</w:t>
+      </w:r>
+    </w:p>
+    <w:p>
+      <w:pPr>
+        <w:spacing w:after="200" w:line="276"/>
+      </w:pPr>
+      <w:r>
+        <w:rPr>
+          <w:rFonts w:ascii="Calibri" w:cs="Calibri" w:eastAsia="Calibri" w:hAnsi="Calibri"/>
+          <w:sz w:val="22"/>
+          <w:szCs w:val="22"/>
+        </w:rPr>
+        <w:t xml:space="preserve">The wording change was reverted in full — confirmed byte-identical to the last committed version — and the script defect fixed separately. This is not pursued into a third wording attempt, consistent with this project's practice elsewhere (Section 6.8) of treating a limitation that does not respond to a second, more precise wording attempt as a genuine plateau rather than a wording problem still waiting to be solved. Section 8.15's characterisation stands as the accurate, current description of Check 1 Part B's behaviour; a structural rather than wording-only approach is identified as remaining work in Section 10.3.</w:t>
       </w:r>
     </w:p>
     <w:p>
@@ -7495,7 +7569,7 @@
           <w:sz w:val="22"/>
           <w:szCs w:val="22"/>
         </w:rPr>
-        <w:t xml:space="preserve">Check 1 Part B's rejection of a mislabelled internal trigger is framing-dependent rather than uniformly robust (Section 8.15): a controlled round of nine fresh, independently-worded framings on the Ohio Warehouse fixture found four of nine correctly rejected, with the five passes sharing a specific mechanism — the check's own reasoning substituted the presence of explicit decision language for genuine control, letting a vendor-attributed, symptom-framed, bare-dated, “objective”-registered, or hedged-uncertainty trigger through where the same underlying internal action would be rejected if named directly. Framings that kept an internal actor, action, or transition nameable within the trigger sentence itself were rejected in all four cases tested.</w:t>
+        <w:t xml:space="preserve">Check 1 Part B's rejection of a mislabelled internal trigger is framing-dependent rather than uniformly robust (Section 8.15): a controlled round of nine fresh, independently-worded framings on the Ohio Warehouse fixture found four of nine correctly rejected, with the five passes sharing a specific mechanism — the check's own reasoning substituted the presence of explicit decision language for genuine control, letting a vendor-attributed, symptom-framed, bare-dated, “objective”-registered, or hedged-uncertainty trigger through where the same underlying internal action would be rejected if named directly. Framings that kept an internal actor, action, or transition nameable within the trigger sentence itself were rejected in all four cases tested. A wording fix targeting this exact mechanism was subsequently attempted and made the problem worse, not better — two of sixteen pooled trials correct against the four-of-nine baseline — and was reverted (Section 8.17); a longer, more explicit instruction is not reported as a viable path to closing this gap.</w:t>
       </w:r>
     </w:p>
     <w:p>
@@ -7648,7 +7722,7 @@
           <w:sz w:val="22"/>
           <w:szCs w:val="22"/>
         </w:rPr>
-        <w:t xml:space="preserve">A wording fix to Check 1 Part B targeting the specific substitution mechanism identified in Section 8.15 (explicit decision language standing in for genuine control), followed by a fresh controlled round on the Ohio Warehouse fixture at the same n=9 scale used here, to confirm whether the fix closes the gap without narrowing what the check catches elsewhere.</w:t>
+        <w:t xml:space="preserve">A structural, non-wording approach to Check 1 Part B's framing-dependence (Section 8.17), given a targeted wording fix was attempted and found to make the problem worse rather than better — for example, restructuring what the Auditor is asked to produce for this check (e.g. requiring an explicit statement of who chose or could have prevented the named trigger, rather than a free-form justification) instead of further constraining what it is told not to do.</w:t>
       </w:r>
     </w:p>
     <w:p>

</xml_diff>

<commit_message>
docs: Phase 67 -- structural Check 1 Part B fix attempted and reverted
DEVELOPMENT_LOG.md: new Phase 67 entry (Problem/Diagnosis/Fix/Lesson)
covering the structural fix attempt and its more specific failure
mode than Phase 66's.

MASS_System_Development_Report.docx:
- New Section 8.18 reporting the attempt in full
- Section 10.2's Check 1 Part B limitation bullet extended to cover
  both failed attempts
- Section 10.3's "structural approach, still to be tried" bullet
  replaced with the actual remaining path: moving actor-to-verdict
  classification out of the model's judgment and into deterministic
  code, since both prompt-level attempts are now closed
- Executive summary updated with the second attempt's outcome and
  extended section list (...8.17, 8.18, and 9)

Schema-validated against the original (423->429 paragraphs, all
validations passed) and visually confirmed on the rendered PDF before
this commit.
</commit_message>
<xml_diff>
--- a/MASS_System_Development_Report.docx
+++ b/MASS_System_Development_Report.docx
@@ -91,7 +91,7 @@
           <w:sz w:val="22"/>
           <w:szCs w:val="22"/>
         </w:rPr>
-        <w:t xml:space="preserve">Since this validation was completed, the corpus was extended with two further real, publicly documented cases from Pakistan — the 2020 PIA Karachi crash and its associated pilot-licensing and financial crisis, and the 2022 collapse of Airlift Technologies — chosen specifically to ground the corpus in the market this project targets for eventual real-world use. The forced-ranking fabrication result and the Auditor's detection of it were subsequently extended to both new cases at the same n=9 scale used for the original three, reaching a clean 9 of 9 fabricated and 9 of 9 caught for each, and surfacing a domain-dependent refinement of the omission-blindness finding (Section 8.16): a discrete trigger event was omitted from the ranking in most trials, while a diffuse macroeconomic trigger retained its own line in nearly all of them. A further, smaller-scale test characterised the Auditor's Check 1 at rejecting an internal decision relabelled as an external trigger, correctly rejecting it in eight of nine attempts across two earlier rounds against a dedicated synthetic fixture. A third, deliberately differentiated round of nine fresh, independently-worded framings then found this robustness to be framing-dependent rather than uniform, correctly rejecting only four of nine, with a reproducible mechanism identified behind the misses rather than an unexplained miss rate. A wording fix targeting that mechanism was then attempted and found to make the problem worse rather than better, and was reverted (Section 8.17). A separate re-validation of the Orchestrator's fidelity check at this same n=9 scale found six of its seven fixture/check combinations replicating perfectly, but overturned a previously-reported clean result on the seventh: Check C's scope-qualifier check, which an earlier n=3 round had found catching a real report's dropped qualifiers in all three trials, caught them in only one of nine at this larger scale. The system was also given a working demonstration interface that reports genuine backend pipeline state in real time, rather than a simulated timer, and produces a downloadable report carrying its own verification status and provenance. The Intake agent was also validated against weak grammar and code-switched Roman Urdu/English input matching this project's actual target market, holding at zero hedge-to-certainty promotions across 25 trials, a narrow vague-quantifier exception found in this pass was fixed and confirmed stable across two further validation rounds, while a related causal-inference pattern persisted across two targeted wording fixes and is documented as a limitation rather than corrected. These extensions are reported in Sections 4.2, 6.8, 6.9, 8.13, 8.15, 8.16, 8.17, and 9.</w:t>
+        <w:t xml:space="preserve">Since this validation was completed, the corpus was extended with two further real, publicly documented cases from Pakistan — the 2020 PIA Karachi crash and its associated pilot-licensing and financial crisis, and the 2022 collapse of Airlift Technologies — chosen specifically to ground the corpus in the market this project targets for eventual real-world use. The forced-ranking fabrication result and the Auditor's detection of it were subsequently extended to both new cases at the same n=9 scale used for the original three, reaching a clean 9 of 9 fabricated and 9 of 9 caught for each, and surfacing a domain-dependent refinement of the omission-blindness finding (Section 8.16): a discrete trigger event was omitted from the ranking in most trials, while a diffuse macroeconomic trigger retained its own line in nearly all of them. A further, smaller-scale test characterised the Auditor's Check 1 at rejecting an internal decision relabelled as an external trigger, correctly rejecting it in eight of nine attempts across two earlier rounds against a dedicated synthetic fixture. A third, deliberately differentiated round of nine fresh, independently-worded framings then found this robustness to be framing-dependent rather than uniform, correctly rejecting only four of nine, with a reproducible mechanism identified behind the misses rather than an unexplained miss rate. A wording fix targeting that mechanism was then attempted and found to make the problem worse rather than better, and was reverted (Section 8.17); a second, structural attempt requiring the Auditor to name the trigger's controlling actor before its verdict was also tried, correctly identified the actor as internal in every miss, but still made the problem worse by applying an unrelated test to reach its verdict, and was likewise reverted (Section 8.18). A separate re-validation of the Orchestrator's fidelity check at this same n=9 scale found six of its seven fixture/check combinations replicating perfectly, but overturned a previously-reported clean result on the seventh: Check C's scope-qualifier check, which an earlier n=3 round had found catching a real report's dropped qualifiers in all three trials, caught them in only one of nine at this larger scale. The system was also given a working demonstration interface that reports genuine backend pipeline state in real time, rather than a simulated timer, and produces a downloadable report carrying its own verification status and provenance. The Intake agent was also validated against weak grammar and code-switched Roman Urdu/English input matching this project's actual target market, holding at zero hedge-to-certainty promotions across 25 trials, a narrow vague-quantifier exception found in this pass was fixed and confirmed stable across two further validation rounds, while a related causal-inference pattern persisted across two targeted wording fixes and is documented as a limitation rather than corrected. These extensions are reported in Sections 4.2, 6.8, 6.9, 8.13, 8.15, 8.16, 8.17, 8.18, and 9.</w:t>
       </w:r>
     </w:p>
     <w:p>
@@ -5211,6 +5211,80 @@
     </w:p>
     <w:p>
       <w:pPr>
+        <w:pStyle w:val="Heading2"/>
+        <w:spacing w:after="120" w:before="280"/>
+      </w:pPr>
+      <w:r>
+        <w:t xml:space="preserve">8.18 A Structural Fix for Check 1 Part B Was Also Attempted and Reverted: A Correctly-Identified Actor Did Not Bind the Verdict</w:t>
+      </w:r>
+    </w:p>
+    <w:p>
+      <w:pPr>
+        <w:spacing w:after="200" w:line="276"/>
+      </w:pPr>
+      <w:r>
+        <w:rPr>
+          <w:rFonts w:ascii="Calibri" w:cs="Calibri" w:eastAsia="Calibri" w:hAnsi="Calibri"/>
+          <w:sz w:val="22"/>
+          <w:szCs w:val="22"/>
+        </w:rPr>
+        <w:t xml:space="preserve">Section 8.17 reverted a wording-only fix to Check 1 Part B and identified a structural, non-wording approach as remaining work in Section 10.3 — specifically, requiring the Auditor to state who chose, performed, or could have prevented the named trigger before deciding a verdict, rather than reasoning to a verdict through free-form justification. This section reports that attempt.</w:t>
+      </w:r>
+    </w:p>
+    <w:p>
+      <w:pPr>
+        <w:spacing w:after="200" w:line="276"/>
+      </w:pPr>
+      <w:r>
+        <w:rPr>
+          <w:rFonts w:ascii="Calibri" w:cs="Calibri" w:eastAsia="Calibri" w:hAnsi="Calibri"/>
+          <w:sz w:val="22"/>
+          <w:szCs w:val="22"/>
+        </w:rPr>
+        <w:t xml:space="preserve">The Auditor's required output format for Part B was changed so a Controlling Actor line must be written before the PASS/FAIL verdict line, naming the specific actor responsible for the triggering event, with the verdict specified to follow directly from that answer rather than from a separate judgment call. No individual evasion pattern was named anywhere in the new wording, deliberately avoiding the closed-checklist effect diagnosed in Section 8.17. The same nine Ohio Warehouse framings and the same five regression fixtures used in Section 8.17 — the restaurant cases, Southwest, and Boeing — were re-run unchanged against the new format.</w:t>
+      </w:r>
+    </w:p>
+    <w:p>
+      <w:pPr>
+        <w:spacing w:after="200" w:line="276"/>
+      </w:pPr>
+      <w:r>
+        <w:rPr>
+          <w:rFonts w:ascii="Calibri" w:cs="Calibri" w:eastAsia="Calibri" w:hAnsi="Calibri"/>
+          <w:sz w:val="22"/>
+          <w:szCs w:val="22"/>
+        </w:rPr>
+        <w:t xml:space="preserve">Two of nine target framings were correctly rejected, below the Section 8.15 baseline of four of nine, while all five regression fixtures held correctly.</w:t>
+      </w:r>
+    </w:p>
+    <w:p>
+      <w:pPr>
+        <w:spacing w:after="200" w:line="276"/>
+      </w:pPr>
+      <w:r>
+        <w:rPr>
+          <w:rFonts w:ascii="Calibri" w:cs="Calibri" w:eastAsia="Calibri" w:hAnsi="Calibri"/>
+          <w:sz w:val="22"/>
+          <w:szCs w:val="22"/>
+        </w:rPr>
+        <w:t xml:space="preserve">Reading the Auditor's own reasoning across all seven misses shows the actor-identification step working exactly as designed: in every case, it correctly named the controlling actor as internal — the company, its leadership, or its IT department — never once mislabelling an internal actor as external. The break is in what followed. Having correctly stated that the actor was internal, the check still returned PASS, applying a different, unrelated test in its stated reasoning: that the diagnosis “correctly identifies the root cause as the company's own management choices, thus satisfying the audit criteria for avoiding conflation,” or that it “does not attempt to blame an external actor for the trigger.” Both are restatements of Part A's distinctness and honest-attribution test, not Part B's control test, mirroring the exact substitution mechanism Section 8.17 diagnosed — but this time surviving even with a correctly-answered intermediate field placed immediately before the verdict it was meant to constrain.</w:t>
+      </w:r>
+    </w:p>
+    <w:p>
+      <w:pPr>
+        <w:spacing w:after="200" w:line="276"/>
+      </w:pPr>
+      <w:r>
+        <w:rPr>
+          <w:rFonts w:ascii="Calibri" w:cs="Calibri" w:eastAsia="Calibri" w:hAnsi="Calibri"/>
+          <w:sz w:val="22"/>
+          <w:szCs w:val="22"/>
+        </w:rPr>
+        <w:t xml:space="preserve">The change was reverted in full — confirmed byte-identical to the last committed version — and the new validation script and its outputs kept as evidence rather than discarded. This is a more specific negative result than Section 8.17's: an explicit, correctly-completed intermediate field did not, by itself, bind the verdict it was instructed to follow from mechanically, showing that a prose instruction describing a dependency between two parts of a required output is not enforced by the model treating it as mechanical. Two prompt-level attempts at this limitation — one wording-only, one requiring a structured intermediate field — have now both made the target result worse than the original wording; this is reported as a second negative result rather than pursued into a third prompt-only attempt, with Section 8.15's characterisation continuing to stand as Check 1 Part B's accurate, current behaviour. The only remaining path identified is moving the actor-to-verdict classification out of the model's own free-form judgment entirely and into deterministic code, which is a more substantial change than a further prompt iteration and is identified as remaining work in Section 10.3 rather than attempted here.</w:t>
+      </w:r>
+    </w:p>
+    <w:p>
+      <w:pPr>
         <w:pStyle w:val="Heading1"/>
         <w:spacing w:after="160" w:before="360"/>
       </w:pPr>
@@ -7569,7 +7643,7 @@
           <w:sz w:val="22"/>
           <w:szCs w:val="22"/>
         </w:rPr>
-        <w:t xml:space="preserve">Check 1 Part B's rejection of a mislabelled internal trigger is framing-dependent rather than uniformly robust (Section 8.15): a controlled round of nine fresh, independently-worded framings on the Ohio Warehouse fixture found four of nine correctly rejected, with the five passes sharing a specific mechanism — the check's own reasoning substituted the presence of explicit decision language for genuine control, letting a vendor-attributed, symptom-framed, bare-dated, “objective”-registered, or hedged-uncertainty trigger through where the same underlying internal action would be rejected if named directly. Framings that kept an internal actor, action, or transition nameable within the trigger sentence itself were rejected in all four cases tested. A wording fix targeting this exact mechanism was subsequently attempted and made the problem worse, not better — two of sixteen pooled trials correct against the four-of-nine baseline — and was reverted (Section 8.17); a longer, more explicit instruction is not reported as a viable path to closing this gap.</w:t>
+        <w:t xml:space="preserve">Check 1 Part B's rejection of a mislabelled internal trigger is framing-dependent rather than uniformly robust (Section 8.15): a controlled round of nine fresh, independently-worded framings on the Ohio Warehouse fixture found four of nine correctly rejected, with the five passes sharing a specific mechanism — the check's own reasoning substituted the presence of explicit decision language for genuine control, letting a vendor-attributed, symptom-framed, bare-dated, “objective”-registered, or hedged-uncertainty trigger through where the same underlying internal action would be rejected if named directly. Framings that kept an internal actor, action, or transition nameable within the trigger sentence itself were rejected in all four cases tested. A wording fix targeting this exact mechanism was subsequently attempted and made the problem worse, not better — two of sixteen pooled trials correct against the four-of-nine baseline — and was reverted (Section 8.17); a longer, more explicit instruction is not reported as a viable path to closing this gap. A second, structural attempt — requiring the Auditor to name the trigger's controlling actor before deciding a verdict — was then tried and also made the problem worse (two of nine, Section 8.18): the actor was correctly identified as internal in every miss, but the verdict did not follow from that answer, applying an unrelated distinctness test instead; this was also reverted, and the limitation is now reported as resistant to two independent prompt-level approaches.</w:t>
       </w:r>
     </w:p>
     <w:p>
@@ -7722,7 +7796,7 @@
           <w:sz w:val="22"/>
           <w:szCs w:val="22"/>
         </w:rPr>
-        <w:t xml:space="preserve">A structural, non-wording approach to Check 1 Part B's framing-dependence (Section 8.17), given a targeted wording fix was attempted and found to make the problem worse rather than better — for example, restructuring what the Auditor is asked to produce for this check (e.g. requiring an explicit statement of who chose or could have prevented the named trigger, rather than a free-form justification) instead of further constraining what it is told not to do.</w:t>
+        <w:t xml:space="preserve">A code-enforced, rather than model-judged, resolution of Check 1 Part B's framing-dependence: two prompt-level attempts — a wording-only fix (Section 8.17) and a structured intermediate field requiring the Auditor to name the trigger's controlling actor before its verdict (Section 8.18) — have both made the target result worse than the original wording, including breaking previously-reliable framings. The actor-naming step itself worked correctly in the second attempt; only the verdict's dependence on it did not hold. The remaining path is moving that classification out of the model's free-form judgment and into deterministic code that parses the stated actor and assigns the verdict directly, rather than asking the model to apply the dependency itself.</w:t>
       </w:r>
     </w:p>
     <w:p>

</xml_diff>

<commit_message>
docs: Phase 68 -- Boeing externality open question resolved
DEVELOPMENT_LOG.md: new Phase 68 entry (Problem/Diagnosis/Fix/Lesson)
covering all three n=9 rounds and the resolution.

MASS_System_Development_Report.docx:
- Section 6.7's original open-question paragraph now points forward
  to Section 8.19
- New Section 8.19 reports all three rounds in full
- Section 10.2's Boeing bullet rewritten from "open question" to the
  actual resolved mechanism (Part B's correctness depends on whether
  the root cause states a motive, not trigger phrasing alone)
- Section 10.3's now-completed "resolution of the open question"
  bullet removed
- Executive summary updated with the finding and extended section
  list (...8.18, 8.19, and 9)

Schema-validated against the prior version (429->434 paragraphs, all
validations passed) and visually confirmed on the rendered PDF before
this commit.
</commit_message>
<xml_diff>
--- a/MASS_System_Development_Report.docx
+++ b/MASS_System_Development_Report.docx
@@ -91,7 +91,7 @@
           <w:sz w:val="22"/>
           <w:szCs w:val="22"/>
         </w:rPr>
-        <w:t xml:space="preserve">Since this validation was completed, the corpus was extended with two further real, publicly documented cases from Pakistan — the 2020 PIA Karachi crash and its associated pilot-licensing and financial crisis, and the 2022 collapse of Airlift Technologies — chosen specifically to ground the corpus in the market this project targets for eventual real-world use. The forced-ranking fabrication result and the Auditor's detection of it were subsequently extended to both new cases at the same n=9 scale used for the original three, reaching a clean 9 of 9 fabricated and 9 of 9 caught for each, and surfacing a domain-dependent refinement of the omission-blindness finding (Section 8.16): a discrete trigger event was omitted from the ranking in most trials, while a diffuse macroeconomic trigger retained its own line in nearly all of them. A further, smaller-scale test characterised the Auditor's Check 1 at rejecting an internal decision relabelled as an external trigger, correctly rejecting it in eight of nine attempts across two earlier rounds against a dedicated synthetic fixture. A third, deliberately differentiated round of nine fresh, independently-worded framings then found this robustness to be framing-dependent rather than uniform, correctly rejecting only four of nine, with a reproducible mechanism identified behind the misses rather than an unexplained miss rate. A wording fix targeting that mechanism was then attempted and found to make the problem worse rather than better, and was reverted (Section 8.17); a second, structural attempt requiring the Auditor to name the trigger's controlling actor before its verdict was also tried, correctly identified the actor as internal in every miss, but still made the problem worse by applying an unrelated test to reach its verdict, and was likewise reverted (Section 8.18). A separate re-validation of the Orchestrator's fidelity check at this same n=9 scale found six of its seven fixture/check combinations replicating perfectly, but overturned a previously-reported clean result on the seventh: Check C's scope-qualifier check, which an earlier n=3 round had found catching a real report's dropped qualifiers in all three trials, caught them in only one of nine at this larger scale. The system was also given a working demonstration interface that reports genuine backend pipeline state in real time, rather than a simulated timer, and produces a downloadable report carrying its own verification status and provenance. The Intake agent was also validated against weak grammar and code-switched Roman Urdu/English input matching this project's actual target market, holding at zero hedge-to-certainty promotions across 25 trials, a narrow vague-quantifier exception found in this pass was fixed and confirmed stable across two further validation rounds, while a related causal-inference pattern persisted across two targeted wording fixes and is documented as a limitation rather than corrected. These extensions are reported in Sections 4.2, 6.8, 6.9, 8.13, 8.15, 8.16, 8.17, 8.18, and 9.</w:t>
+        <w:t xml:space="preserve">Since this validation was completed, the corpus was extended with two further real, publicly documented cases from Pakistan — the 2020 PIA Karachi crash and its associated pilot-licensing and financial crisis, and the 2022 collapse of Airlift Technologies — chosen specifically to ground the corpus in the market this project targets for eventual real-world use. The forced-ranking fabrication result and the Auditor's detection of it were subsequently extended to both new cases at the same n=9 scale used for the original three, reaching a clean 9 of 9 fabricated and 9 of 9 caught for each, and surfacing a domain-dependent refinement of the omission-blindness finding (Section 8.16): a discrete trigger event was omitted from the ranking in most trials, while a diffuse macroeconomic trigger retained its own line in nearly all of them. A further, smaller-scale test characterised the Auditor's Check 1 at rejecting an internal decision relabelled as an external trigger, correctly rejecting it in eight of nine attempts across two earlier rounds against a dedicated synthetic fixture. A third, deliberately differentiated round of nine fresh, independently-worded framings then found this robustness to be framing-dependent rather than uniform, correctly rejecting only four of nine, with a reproducible mechanism identified behind the misses rather than an unexplained miss rate. A wording fix targeting that mechanism was then attempted and found to make the problem worse rather than better, and was reverted (Section 8.17); a second, structural attempt requiring the Auditor to name the trigger's controlling actor before its verdict was also tried, correctly identified the actor as internal in every miss, but still made the problem worse by applying an unrelated test to reach its verdict, and was likewise reverted (Section 8.18). A further three-round n=9 investigation resolved an older open question about Boeing's only trigger candidate — a technical malfunction closely tied to its diagnosed design flaw — finding that Part B's correctness on this case depends on whether the diagnosis's own wording states a motive for the underlying decision, not on an independent judgment of foreseeability (Section 8.19). A separate re-validation of the Orchestrator's fidelity check at this same n=9 scale found six of its seven fixture/check combinations replicating perfectly, but overturned a previously-reported clean result on the seventh: Check C's scope-qualifier check, which an earlier n=3 round had found catching a real report's dropped qualifiers in all three trials, caught them in only one of nine at this larger scale. The system was also given a working demonstration interface that reports genuine backend pipeline state in real time, rather than a simulated timer, and produces a downloadable report carrying its own verification status and provenance. The Intake agent was also validated against weak grammar and code-switched Roman Urdu/English input matching this project's actual target market, holding at zero hedge-to-certainty promotions across 25 trials, a narrow vague-quantifier exception found in this pass was fixed and confirmed stable across two further validation rounds, while a related causal-inference pattern persisted across two targeted wording fixes and is documented as a limitation rather than corrected. These extensions are reported in Sections 4.2, 6.8, 6.9, 8.13, 8.15, 8.16, 8.17, 8.18, 8.19, and 9.</w:t>
       </w:r>
     </w:p>
     <w:p>
@@ -1403,7 +1403,7 @@
           <w:sz w:val="22"/>
           <w:szCs w:val="22"/>
         </w:rPr>
-        <w:t xml:space="preserve">The Boeing result deserves separate comment, since it concerns the Auditor's Check 1 (Section 6.4) rather than the fidelity check itself. Both attempts framed the trigger as Boeing's own internal decision — first, the sensor's erroneous data; on revision, the decision to rely on a single sensor — and Check 1's externality test correctly rejected both, on the grounds that a company's own design and business choices are not external events regardless of how they are phrased. This is a genuinely harder case than the two validation cases (Southwest, Peloton) the check was calibrated against: both of those have an unambiguous macro-environmental trigger (a storm, a pandemic demand reversal), while Boeing's only trigger candidate is a specific technical malfunction that sits close to being a foreseeable consequence of the very design decision the diagnosis identifies as the root cause. Whether Check 1's definition of “external” should be extended to accommodate this category of case, or whether the pipeline correctly recognises that this case lacks the clean trigger/root-cause split the other two have and routes it to human review accordingly, is reported here as an open question rather than resolved either way.</w:t>
+        <w:t xml:space="preserve">The Boeing result deserves separate comment, since it concerns the Auditor's Check 1 (Section 6.4) rather than the fidelity check itself. Both attempts framed the trigger as Boeing's own internal decision — first, the sensor's erroneous data; on revision, the decision to rely on a single sensor — and Check 1's externality test correctly rejected both, on the grounds that a company's own design and business choices are not external events regardless of how they are phrased. This is a genuinely harder case than the two validation cases (Southwest, Peloton) the check was calibrated against: both of those have an unambiguous macro-environmental trigger (a storm, a pandemic demand reversal), while Boeing's only trigger candidate is a specific technical malfunction that sits close to being a foreseeable consequence of the very design decision the diagnosis identifies as the root cause. Whether Check 1's definition of “external” should be extended to accommodate this category of case, or whether the pipeline correctly recognises that this case lacks the clean trigger/root-cause split the other two have and routes it to human review accordingly, is reported here as an open question rather than resolved either way. This question is resolved, with the specific mechanism behind it identified, in Section 8.19.</w:t>
       </w:r>
     </w:p>
     <w:p>
@@ -5285,6 +5285,80 @@
     </w:p>
     <w:p>
       <w:pPr>
+        <w:pStyle w:val="Heading2"/>
+        <w:spacing w:after="120" w:before="280"/>
+      </w:pPr>
+      <w:r>
+        <w:t xml:space="preserve">8.19 The Boeing Externality Open Question, Resolved: Check 1 Part B’s Correctness Depends on Whether the Root Cause States a Motive</w:t>
+      </w:r>
+    </w:p>
+    <w:p>
+      <w:pPr>
+        <w:spacing w:after="200" w:line="276"/>
+      </w:pPr>
+      <w:r>
+        <w:rPr>
+          <w:rFonts w:ascii="Calibri" w:cs="Calibri" w:eastAsia="Calibri" w:hAnsi="Calibri"/>
+          <w:sz w:val="22"/>
+          <w:szCs w:val="22"/>
+        </w:rPr>
+        <w:t xml:space="preserve">Section 6.7 raised an open question resting on a single real data point: whether Check 1 Part B correctly rejects Boeing’s only trigger candidate — a specific technical malfunction closely tied to the diagnosed design flaw — as internal, or whether Part B’s definition of “external” is too narrow for this category of case. This section reports three controlled n=9 rounds that resolve it.</w:t>
+      </w:r>
+    </w:p>
+    <w:p>
+      <w:pPr>
+        <w:spacing w:after="200" w:line="276"/>
+      </w:pPr>
+      <w:r>
+        <w:rPr>
+          <w:rFonts w:ascii="Calibri" w:cs="Calibri" w:eastAsia="Calibri" w:hAnsi="Calibri"/>
+          <w:sz w:val="22"/>
+          <w:szCs w:val="22"/>
+        </w:rPr>
+        <w:t xml:space="preserve">The same trigger framing was held fixed throughout — Section 6.7’s original “erroneous data provided by a single AOA sensor” phrasing — with the root cause varied by round. The first round paired that trigger with a root cause naming the single-sensor design decision and an explicit motive for it (“in order to minimize pilot retraining costs and preserve the 737 MAX’s classification as a variant...”). Eight of nine trials completed (one lost to a transient API error); five of eight correctly rejected the trigger, three passed it — directly overturning Section 6.7’s assumption that Part B applied itself consistently on this case, which had rested on a single trial. The five rejections each traced the sensor error back to the company-controlled design choice that made it possible; the three passes evaluated the sensor event in isolation, in near-identical language across trials, without making that connection. However, the motive clause used a specific regulatory-classification phrase not stated in those exact terms in the case packet, and was correctly flagged by Check 3 in each passing trial — a genuine confound, confirmed by direct comparison against the case text, that left the split impossible to attribute to Part B alone.</w:t>
+      </w:r>
+    </w:p>
+    <w:p>
+      <w:pPr>
+        <w:spacing w:after="200" w:line="276"/>
+      </w:pPr>
+      <w:r>
+        <w:rPr>
+          <w:rFonts w:ascii="Calibri" w:cs="Calibri" w:eastAsia="Calibri" w:hAnsi="Calibri"/>
+          <w:sz w:val="22"/>
+          <w:szCs w:val="22"/>
+        </w:rPr>
+        <w:t xml:space="preserve">A second round removed the motive claim, but in doing so restructured the root cause into three items joined by an explicit list (“combined with... and...”): the single-sensor design, the optional safety features, and minimized pilot training. All nine trials passed the trigger as external. But Check 2 failed seven of the nine, each time reading the bundled list itself as an unweighted, Pareto-style ranking of three causes — trading one confound for another, and leaving open whether the reversal reflected Part B’s real behaviour or the new sentence structure.</w:t>
+      </w:r>
+    </w:p>
+    <w:p>
+      <w:pPr>
+        <w:spacing w:after="200" w:line="276"/>
+      </w:pPr>
+      <w:r>
+        <w:rPr>
+          <w:rFonts w:ascii="Calibri" w:cs="Calibri" w:eastAsia="Calibri" w:hAnsi="Calibri"/>
+          <w:sz w:val="22"/>
+          <w:szCs w:val="22"/>
+        </w:rPr>
+        <w:t xml:space="preserve">A third round reduced the root cause to a single decision — the same single-sensor design — plus one directly connected supporting fact (that Boeing’s own engineers raised concerns about it internally as early as 2015–2016 without the design being changed), phrased as one continuous clause with no bundling and no stated motive; both facts were confirmed directly against the case packet before the fixture was written. All nine trials passed the trigger as external again, with uniform reasoning across every trial — none traced the malfunction back to the design decision despite that decision appearing one clause away.</w:t>
+      </w:r>
+    </w:p>
+    <w:p>
+      <w:pPr>
+        <w:spacing w:after="200" w:line="276"/>
+      </w:pPr>
+      <w:r>
+        <w:rPr>
+          <w:rFonts w:ascii="Calibri" w:cs="Calibri" w:eastAsia="Calibri" w:hAnsi="Calibri"/>
+          <w:sz w:val="22"/>
+          <w:szCs w:val="22"/>
+        </w:rPr>
+        <w:t xml:space="preserve">Read together, the one variable present in the round that produced rejections and absent from both rounds that did not is a stated motive: WHY the company made the decision, not just WHAT the decision was. With a motive stated, Part B correctly connects the malfunction to the decision in five of eight trials; without one — independently, twice, at nine of nine each time — it treats the same malfunction as free-floating and external despite the causal decision remaining present in the text. This resolves Section 6.7’s question as neither of its two proposed readings: not that Part B’s definition of “external” is too narrow, and not that Boeing consistently and correctly lacks a clean trigger. It is a third, more specific finding — the same underlying shape already characterised for a different fixture in Sections 8.15, 8.17, and 8.18: Part B responds to a textual cue rather than independently reasoning about foreseeability or control, here demonstrated on the real case that first raised the question rather than a synthetic one.</w:t>
+      </w:r>
+    </w:p>
+    <w:p>
+      <w:pPr>
         <w:pStyle w:val="Heading1"/>
         <w:spacing w:after="160" w:before="360"/>
       </w:pPr>
@@ -7499,7 +7573,7 @@
           <w:sz w:val="22"/>
           <w:szCs w:val="22"/>
         </w:rPr>
-        <w:t xml:space="preserve">Check 1's externality test has been validated on four cases with a clear external trigger — Southwest and Peloton (Section 8.7), and PIA and Airlift (Section 8.14) — passing cleanly on all four; a fifth case (Boeing) whose only trigger candidate is a specific technical malfunction closely tied to the diagnosed design flaw produced a consistent rejection across two attempts (Section 6.7), which may reflect either a correctly narrow definition of “external” or a genuine limitation of a binary trigger/root-cause split for this category of case. This is reported as an open question rather than resolved either way.</w:t>
+        <w:t xml:space="preserve">Check 1's externality test has been validated on four cases with a clear external trigger — Southwest and Peloton (Section 8.7), and PIA and Airlift (Section 8.14) — passing cleanly on all four; a fifth case (Boeing), whose only trigger candidate is a specific technical malfunction closely tied to the diagnosed design flaw, was resolved across three controlled n=9 rounds (Section 8.19) rather than left open. The result is not a fixed rejection rate but a specific mechanism: Part B correctly rejects the malfunction as internal when the diagnosis's root cause states the company's motive for the underlying design decision (five of eight trials), but accepts it as external when the same decision is stated without a motive, reproduced independently across two further nine-trial rounds (eighteen of eighteen). This is a textual-cue dependency of the same shape already characterised for Ohio Warehouse (Sections 8.15, 8.17, 8.18), now demonstrated on the real case that first raised the question.</w:t>
       </w:r>
     </w:p>
     <w:p>
@@ -7707,24 +7781,6 @@
           <w:szCs w:val="22"/>
         </w:rPr>
         <w:t xml:space="preserve">A direct test of whether the Auditor's own Check 1, Check 2, and Check 3 exhibit the same cross-check dependency confirmed for the fidelity check's checks prior to their architectural isolation (Section 6.7), since all three have always shared a single prompt in the same way the fidelity check's did before its Section 6.7 rewrite.</w:t>
-      </w:r>
-    </w:p>
-    <w:p>
-      <w:pPr>
-        <w:pStyle w:val="ListParagraph"/>
-        <w:numPr>
-          <w:ilvl w:val="0"/>
-          <w:numId w:val="2"/>
-        </w:numPr>
-        <w:spacing w:after="100" w:line="276"/>
-      </w:pPr>
-      <w:r>
-        <w:rPr>
-          <w:rFonts w:ascii="Calibri" w:cs="Calibri" w:eastAsia="Calibri" w:hAnsi="Calibri"/>
-          <w:sz w:val="22"/>
-          <w:szCs w:val="22"/>
-        </w:rPr>
-        <w:t xml:space="preserve">Resolution of the open question identified in Section 6.7 regarding Check 1's externality boundary on technical-malfunction cases, either by extending the check's definition or by confirming that routing such cases to human review is the correct behaviour rather than a limitation.</w:t>
       </w:r>
     </w:p>
     <w:p>

</xml_diff>

<commit_message>
docs: Phase 70 -- Check 4 (ranking completeness) first validation documented
DEVELOPMENT_LOG.md: new Phase 70 entry covering the check's design
rationale (isolated architecture, no Analyst change needed), the n=18
validation against existing PIA/Airlift diagnoses, and the specific
causal-adjacency leniency mechanism found behind the 6 PIA misses.

MASS_System_Development_Report.docx:
- New Section 8.21 reports the full finding
- Section 10.3's "scoping decision, not yet built" bullet replaced
  with the actual n=18 result and the two remaining paths (a further
  wording round, or documenting this as the candidate check's
  characterized behavior)
- Executive summary updated with the finding and extended section
  list (...8.19, 8.21, and 9)

Schema-validated against the prior version (439->444 paragraphs, all
validations passed) and visually confirmed on the rendered PDF before
this commit.
</commit_message>
<xml_diff>
--- a/MASS_System_Development_Report.docx
+++ b/MASS_System_Development_Report.docx
@@ -91,7 +91,7 @@
           <w:sz w:val="22"/>
           <w:szCs w:val="22"/>
         </w:rPr>
-        <w:t xml:space="preserve">Since this validation was completed, the corpus was extended with two further real, publicly documented cases from Pakistan — the 2020 PIA Karachi crash and its associated pilot-licensing and financial crisis, and the 2022 collapse of Airlift Technologies — chosen specifically to ground the corpus in the market this project targets for eventual real-world use. The forced-ranking fabrication result and the Auditor's detection of it were subsequently extended to both new cases at the same n=9 scale used for the original three, reaching a clean 9 of 9 fabricated and 9 of 9 caught for each, and surfacing a domain-dependent refinement of the omission-blindness finding (Section 8.16): a discrete trigger event was omitted from the ranking in most trials, while a diffuse macroeconomic trigger retained its own line in nearly all of them. A further, smaller-scale test characterised the Auditor's Check 1 at rejecting an internal decision relabelled as an external trigger, correctly rejecting it in eight of nine attempts across two earlier rounds against a dedicated synthetic fixture. A third, deliberately differentiated round of nine fresh, independently-worded framings then found this robustness to be framing-dependent rather than uniform, correctly rejecting only four of nine, with a reproducible mechanism identified behind the misses rather than an unexplained miss rate. A wording fix targeting that mechanism was then attempted and found to make the problem worse rather than better, and was reverted (Section 8.17); a second, structural attempt requiring the Auditor to name the trigger's controlling actor before its verdict was also tried, correctly identified the actor as internal in every miss, but still made the problem worse by applying an unrelated test to reach its verdict, and was likewise reverted (Section 8.18). A further three-round n=9 investigation resolved an older open question about Boeing's only trigger candidate — a technical malfunction closely tied to its diagnosed design flaw — finding that Part B's correctness on this case depends on whether the diagnosis's own wording states a motive for the underlying decision, not on an independent judgment of foreseeability (Section 8.19). A separate re-validation of the Orchestrator's fidelity check at this same n=9 scale found six of its seven fixture/check combinations replicating perfectly, but overturned a previously-reported clean result on the seventh: Check C's scope-qualifier check, which an earlier n=3 round had found catching a real report's dropped qualifiers in all three trials, caught them in only one of nine at this larger scale. The system was also given a working demonstration interface that reports genuine backend pipeline state in real time, rather than a simulated timer, and produces a downloadable report carrying its own verification status and provenance. The Intake agent was also validated against weak grammar and code-switched Roman Urdu/English input matching this project's actual target market, holding at zero hedge-to-certainty promotions across 25 trials, a narrow vague-quantifier exception found in this pass was fixed and confirmed stable across two further validation rounds, while a related causal-inference pattern persisted across two targeted wording fixes and is documented as a limitation rather than corrected. These extensions are reported in Sections 4.2, 6.8, 6.9, 8.13, 8.15, 8.16, 8.17, 8.18, 8.19, and 9.</w:t>
+        <w:t xml:space="preserve">Since this validation was completed, the corpus was extended with two further real, publicly documented cases from Pakistan — the 2020 PIA Karachi crash and its associated pilot-licensing and financial crisis, and the 2022 collapse of Airlift Technologies — chosen specifically to ground the corpus in the market this project targets for eventual real-world use. The forced-ranking fabrication result and the Auditor's detection of it were subsequently extended to both new cases at the same n=9 scale used for the original three, reaching a clean 9 of 9 fabricated and 9 of 9 caught for each, and surfacing a domain-dependent refinement of the omission-blindness finding (Section 8.16): a discrete trigger event was omitted from the ranking in most trials, while a diffuse macroeconomic trigger retained its own line in nearly all of them. A further, smaller-scale test characterised the Auditor's Check 1 at rejecting an internal decision relabelled as an external trigger, correctly rejecting it in eight of nine attempts across two earlier rounds against a dedicated synthetic fixture. A third, deliberately differentiated round of nine fresh, independently-worded framings then found this robustness to be framing-dependent rather than uniform, correctly rejecting only four of nine, with a reproducible mechanism identified behind the misses rather than an unexplained miss rate. A wording fix targeting that mechanism was then attempted and found to make the problem worse rather than better, and was reverted (Section 8.17); a second, structural attempt requiring the Auditor to name the trigger's controlling actor before its verdict was also tried, correctly identified the actor as internal in every miss, but still made the problem worse by applying an unrelated test to reach its verdict, and was likewise reverted (Section 8.18). A further three-round n=9 investigation resolved an older open question about Boeing's only trigger candidate — a technical malfunction closely tied to its diagnosed design flaw — finding that Part B's correctness on this case depends on whether the diagnosis's own wording states a motive for the underlying decision, not on an independent judgment of foreseeability (Section 8.19). A separate re-validation of the Orchestrator's fidelity check at this same n=9 scale found six of its seven fixture/check combinations replicating perfectly, but overturned a previously-reported clean result on the seventh: Check C's scope-qualifier check, which an earlier n=3 round had found catching a real report's dropped qualifiers in all three trials, caught them in only one of nine at this larger scale. The system was also given a working demonstration interface that reports genuine backend pipeline state in real time, rather than a simulated timer, and produces a downloadable report carrying its own verification status and provenance. The Intake agent was also validated against weak grammar and code-switched Roman Urdu/English input matching this project's actual target market, holding at zero hedge-to-certainty promotions across 25 trials, a narrow vague-quantifier exception found in this pass was fixed and confirmed stable across two further validation rounds, while a related causal-inference pattern persisted across two targeted wording fixes and is documented as a limitation rather than corrected. A candidate fourth Auditor check (ranking completeness), addressing the project's documented omission-blindness gap, was designed and validated at n=18 against real PIA/Airlift diagnoses: correct on all 9 Airlift trials, correct on 3 of 9 PIA trials, with a specific, evidenced leniency mechanism identified behind the misses rather than an unexplained failure rate (Section 8.21). These extensions are reported in Sections 4.2, 6.8, 6.9, 8.13, 8.15, 8.16, 8.17, 8.18, 8.19, 8.21, and 9.</w:t>
       </w:r>
     </w:p>
     <w:p>
@@ -5420,6 +5420,67 @@
     </w:p>
     <w:p>
       <w:pPr>
+        <w:pStyle w:val="Heading2"/>
+        <w:spacing w:after="120" w:before="280"/>
+      </w:pPr>
+      <w:r>
+        <w:t xml:space="preserve">8.21 Check 4 (Ranking Completeness) Built and Validated at n=18: 9/9 on Airlift, 3/9 on PIA, with a Specific Leniency Mechanism</w:t>
+      </w:r>
+    </w:p>
+    <w:p>
+      <w:pPr>
+        <w:spacing w:after="200" w:line="276"/>
+      </w:pPr>
+      <w:r>
+        <w:rPr>
+          <w:rFonts w:ascii="Calibri" w:cs="Calibri" w:eastAsia="Calibri" w:hAnsi="Calibri"/>
+          <w:sz w:val="22"/>
+          <w:szCs w:val="22"/>
+        </w:rPr>
+        <w:t xml:space="preserve">Section 10.3 had scoped a candidate fourth Auditor check — verifying that a diagnosis’s ranking table doesn’t silently omit its own labeled Triggering Event or Root Cause, addressing the omission-blindness gap Sections 8.8/8.9/8.14 documented — as a scoping decision rather than a build. This section reports the first design and validation pass.</w:t>
+      </w:r>
+    </w:p>
+    <w:p>
+      <w:pPr>
+        <w:spacing w:after="200" w:line="276"/>
+      </w:pPr>
+      <w:r>
+        <w:rPr>
+          <w:rFonts w:ascii="Calibri" w:cs="Calibri" w:eastAsia="Calibri" w:hAnsi="Calibri"/>
+          <w:sz w:val="22"/>
+          <w:szCs w:val="22"/>
+        </w:rPr>
+        <w:t xml:space="preserve">The check needs no change to the Analyst’s output: every diagnosis already labels its Triggering Event and Root Cause explicitly, in the same structure Check 1 already parses. It was built as its own isolated Agent/Task/Crew (`ranking_completeness_check.py`), mirroring the fidelity check’s Check A/B/C architecture, specifically to avoid adding a fourth check to Check 1/2/3’s shared prompt while whether that shared prompt has the same cross-check dependency the fidelity check had before its Section 6.7 isolation remains its own open question (Section 10.3). Validated against all 18 already-saved PIA/Airlift forced-ranking diagnoses (Phase 60/65) — zero new diagnosis-generation calls, only 18 new Check-4-only calls — with ground truth for each of the 18 confirmed by direct reading before the test was written, including one internal PIA contrast case that gives the crash its own ranked row.</w:t>
+      </w:r>
+    </w:p>
+    <w:p>
+      <w:pPr>
+        <w:spacing w:after="200" w:line="276"/>
+      </w:pPr>
+      <w:r>
+        <w:rPr>
+          <w:rFonts w:ascii="Calibri" w:cs="Calibri" w:eastAsia="Calibri" w:hAnsi="Calibri"/>
+          <w:sz w:val="22"/>
+          <w:szCs w:val="22"/>
+        </w:rPr>
+        <w:t xml:space="preserve">Result: 9 of 9 correct on Airlift, 3 of 9 correct on PIA (12 of 18 overall). Reading all 6 PIA mismatches shows one consistent mechanism: in each case, the check finds a row causally connected to the trigger — its rationale mentions the crash as something that “resulted in,” “exposed,” or “triggered” something else — and treats that causal connection as correspondence, rather than requiring the row’s own named cause to BE the trigger. One trial accepts a row literally labeled “External Regulatory Sanctions (The ‘Effect’)” — the diagnosis’s own named effect, not its cause — as a match for the trigger. The two correct PIA rejections explicitly refuse exactly this substitution, stating plainly that no corresponding line item exists.</w:t>
+      </w:r>
+    </w:p>
+    <w:p>
+      <w:pPr>
+        <w:spacing w:after="200" w:line="276"/>
+      </w:pPr>
+      <w:r>
+        <w:rPr>
+          <w:rFonts w:ascii="Calibri" w:cs="Calibri" w:eastAsia="Calibri" w:hAnsi="Calibri"/>
+          <w:sz w:val="22"/>
+          <w:szCs w:val="22"/>
+        </w:rPr>
+        <w:t xml:space="preserve">Airlift’s clean sweep is consistent with the same mechanism rather than a separate success: its trigger is already a macro-category noun (“VC winter,” “market shift”) that maps onto a single row nearly directly, leaving the check no causally-adjacent rows to mistake for a match. PK8303’s discrete, narrated event gets referenced in several unrelated rows’ background reasoning, giving the same leniency more surface area to act on. This is a real first-pass result for a brand-new check — stronger, in fact, than Check 1 Part B’s original 4-of-9 baseline (Section 8.15) — reported here as a designed-and-validated candidate with a specific, evidenced leniency mechanism, not a closed result. Given this project’s 0-for-2 record on prompt-level fixes to Check 1 Part B in the same session (Sections 8.17, 8.18), a further wording round tightening what “corresponds” means is identified as optional future work rather than attempted immediately.</w:t>
+      </w:r>
+    </w:p>
+    <w:p>
+      <w:pPr>
         <w:pStyle w:val="Heading1"/>
         <w:spacing w:after="160" w:before="360"/>
       </w:pPr>
@@ -7805,7 +7866,7 @@
           <w:sz w:val="22"/>
           <w:szCs w:val="22"/>
         </w:rPr>
-        <w:t xml:space="preserve">Design and validation of a ranking-completeness check (a candidate fourth check, following Check 3’s addition in Section 8.11), following the same empirical refinement process used for Check 2 in Section 6.4 and Check 3 in Section 8.11, if closing the gap confirmed in Section 8.9 is judged worth the added complexity — this is a scoping decision, not a correction to Check 2, which was confirmed to behave as designed for the claims it evaluates.</w:t>
+        <w:t xml:space="preserve">A ranking-completeness check (Check 4) was designed and validated at n=18 against real PIA/Airlift diagnoses (Section 8.21): 9 of 9 correct on Airlift, 3 of 9 on PIA, with a specific, evidenced leniency mechanism behind the PIA misses (a causally-adjacent row accepted as a match for the trigger, rather than requiring the row's own named cause to be the trigger). Remaining work is either a further wording round tightening what "corresponds" means, or documenting the current result as the candidate check's characterised behaviour rather than pursuing a third same-session prompt-level fix, given Check 1 Part B's 0-for-2 record on that approach (Sections 8.17, 8.18).</w:t>
       </w:r>
     </w:p>
     <w:p>

</xml_diff>